<commit_message>
Paper: colour-blind-safe figure palette and arXiv LaTeX source package
Restyle all 21 charts and 8 diagrams with the shared Okabe-Ito colour
system: one meaning per hue across every figure, tints only behind text,
near-black text throughout. Fix a Mermaid font-measurement issue that let
note text overflow its box.

Add build_arxiv.py with a pandoc LaTeX template and caption filter that
produce an arXiv-ready source package (main.tex plus flattened figures),
compiled with pdflatex with no errors or overfull boxes and all fonts
embedded. Rebuild the PDF, Word and arXiv outputs.
</commit_message>
<xml_diff>
--- a/paper/VecForge-2.0-Paper.docx
+++ b/paper/VecForge-2.0-Paper.docx
@@ -113,7 +113,7 @@
         <w:pStyle w:val="Date"/>
       </w:pPr>
       <w:r>
-        <w:t xml:space="preserve">ArcGX TechLabs Private Limited, Tiruchirappalli, Tamil Nadu, India · suneelbose@arcgx.in · October 2026</w:t>
+        <w:t xml:space="preserve">ArcGX TechLabs Private Limited, Tiruchirappalli, Tamil Nadu, India. suneelbose@arcgx.in. ORCID iD https://orcid.org/0009-0000-9282-2287. October 2026</w:t>
       </w:r>
     </w:p>
     <w:p>
@@ -159,12 +159,6 @@
         <w:t xml:space="preserve"> </w:t>
       </w:r>
       <w:r>
-        <w:t xml:space="preserve">increasingly</w:t>
-      </w:r>
-      <w:r>
-        <w:t xml:space="preserve"> </w:t>
-      </w:r>
-      <w:r>
         <w:t xml:space="preserve">need</w:t>
       </w:r>
       <w:r>
@@ -387,7 +381,7 @@
         <w:t xml:space="preserve"> </w:t>
       </w:r>
       <w:r>
-        <w:t xml:space="preserve">around</w:t>
+        <w:t xml:space="preserve">for</w:t>
       </w:r>
       <w:r>
         <w:t xml:space="preserve"> </w:t>
@@ -417,13 +411,7 @@
         <w:t xml:space="preserve"> </w:t>
       </w:r>
       <w:r>
-        <w:t xml:space="preserve">every</w:t>
-      </w:r>
-      <w:r>
-        <w:t xml:space="preserve"> </w:t>
-      </w:r>
-      <w:r>
-        <w:t xml:space="preserve">one</w:t>
+        <w:t xml:space="preserve">each</w:t>
       </w:r>
       <w:r>
         <w:t xml:space="preserve"> </w:t>
@@ -447,97 +435,1309 @@
         <w:t xml:space="preserve"> </w:t>
       </w:r>
       <w:r>
+        <w:t xml:space="preserve">One</w:t>
+      </w:r>
+      <w:r>
+        <w:t xml:space="preserve"> </w:t>
+      </w:r>
+      <w:r>
+        <w:t xml:space="preserve">SQLite</w:t>
+      </w:r>
+      <w:r>
+        <w:t xml:space="preserve"> </w:t>
+      </w:r>
+      <w:r>
+        <w:t xml:space="preserve">file,</w:t>
+      </w:r>
+      <w:r>
+        <w:t xml:space="preserve"> </w:t>
+      </w:r>
+      <w:r>
+        <w:t xml:space="preserve">optionally</w:t>
+      </w:r>
+      <w:r>
+        <w:t xml:space="preserve"> </w:t>
+      </w:r>
+      <w:r>
+        <w:t xml:space="preserve">encrypted</w:t>
+      </w:r>
+      <w:r>
+        <w:t xml:space="preserve"> </w:t>
+      </w:r>
+      <w:r>
+        <w:t xml:space="preserve">with</w:t>
+      </w:r>
+      <w:r>
+        <w:t xml:space="preserve"> </w:t>
+      </w:r>
+      <w:r>
+        <w:t xml:space="preserve">SQLCipher,</w:t>
+      </w:r>
+      <w:r>
+        <w:t xml:space="preserve"> </w:t>
+      </w:r>
+      <w:r>
+        <w:t xml:space="preserve">holds</w:t>
+      </w:r>
+      <w:r>
+        <w:t xml:space="preserve"> </w:t>
+      </w:r>
+      <w:r>
+        <w:t xml:space="preserve">documents,</w:t>
+      </w:r>
+      <w:r>
+        <w:t xml:space="preserve"> </w:t>
+      </w:r>
+      <w:r>
+        <w:t xml:space="preserve">vectors,</w:t>
+      </w:r>
+      <w:r>
+        <w:t xml:space="preserve"> </w:t>
+      </w:r>
+      <w:r>
+        <w:t xml:space="preserve">metadata,</w:t>
+      </w:r>
+      <w:r>
+        <w:t xml:space="preserve"> </w:t>
+      </w:r>
+      <w:r>
+        <w:t xml:space="preserve">access</w:t>
+      </w:r>
+      <w:r>
+        <w:t xml:space="preserve"> </w:t>
+      </w:r>
+      <w:r>
+        <w:t xml:space="preserve">keys,</w:t>
+      </w:r>
+      <w:r>
+        <w:t xml:space="preserve"> </w:t>
+      </w:r>
+      <w:r>
+        <w:t xml:space="preserve">agent</w:t>
+      </w:r>
+      <w:r>
+        <w:t xml:space="preserve"> </w:t>
+      </w:r>
+      <w:r>
+        <w:t xml:space="preserve">sessions</w:t>
+      </w:r>
+      <w:r>
+        <w:t xml:space="preserve"> </w:t>
+      </w:r>
+      <w:r>
+        <w:t xml:space="preserve">and</w:t>
+      </w:r>
+      <w:r>
+        <w:t xml:space="preserve"> </w:t>
+      </w:r>
+      <w:r>
+        <w:t xml:space="preserve">index</w:t>
+      </w:r>
+      <w:r>
+        <w:t xml:space="preserve"> </w:t>
+      </w:r>
+      <w:r>
+        <w:t xml:space="preserve">snapshots.</w:t>
+      </w:r>
+      <w:r>
+        <w:t xml:space="preserve"> </w:t>
+      </w:r>
+      <w:r>
+        <w:t xml:space="preserve">Queries</w:t>
+      </w:r>
+      <w:r>
+        <w:t xml:space="preserve"> </w:t>
+      </w:r>
+      <w:r>
+        <w:t xml:space="preserve">fuse</w:t>
+      </w:r>
+      <w:r>
+        <w:t xml:space="preserve"> </w:t>
+      </w:r>
+      <w:r>
+        <w:t xml:space="preserve">FAISS</w:t>
+      </w:r>
+      <w:r>
+        <w:t xml:space="preserve"> </w:t>
+      </w:r>
+      <w:r>
+        <w:t xml:space="preserve">dense</w:t>
+      </w:r>
+      <w:r>
+        <w:t xml:space="preserve"> </w:t>
+      </w:r>
+      <w:r>
+        <w:t xml:space="preserve">search</w:t>
+      </w:r>
+      <w:r>
+        <w:t xml:space="preserve"> </w:t>
+      </w:r>
+      <w:r>
+        <w:t xml:space="preserve">with</w:t>
+      </w:r>
+      <w:r>
+        <w:t xml:space="preserve"> </w:t>
+      </w:r>
+      <w:r>
+        <w:t xml:space="preserve">an</w:t>
+      </w:r>
+      <w:r>
+        <w:t xml:space="preserve"> </w:t>
+      </w:r>
+      <w:r>
+        <w:t xml:space="preserve">incremental</w:t>
+      </w:r>
+      <w:r>
+        <w:t xml:space="preserve"> </w:t>
+      </w:r>
+      <w:r>
+        <w:t xml:space="preserve">BM25</w:t>
+      </w:r>
+      <w:r>
+        <w:t xml:space="preserve"> </w:t>
+      </w:r>
+      <w:r>
+        <w:t xml:space="preserve">index,</w:t>
+      </w:r>
+      <w:r>
+        <w:t xml:space="preserve"> </w:t>
+      </w:r>
+      <w:r>
+        <w:t xml:space="preserve">and</w:t>
+      </w:r>
+      <w:r>
+        <w:t xml:space="preserve"> </w:t>
+      </w:r>
+      <w:r>
+        <w:t xml:space="preserve">namespace</w:t>
+      </w:r>
+      <w:r>
+        <w:t xml:space="preserve"> </w:t>
+      </w:r>
+      <w:r>
+        <w:t xml:space="preserve">and</w:t>
+      </w:r>
+      <w:r>
+        <w:t xml:space="preserve"> </w:t>
+      </w:r>
+      <w:r>
+        <w:t xml:space="preserve">deletion</w:t>
+      </w:r>
+      <w:r>
+        <w:t xml:space="preserve"> </w:t>
+      </w:r>
+      <w:r>
+        <w:t xml:space="preserve">constraints</w:t>
+      </w:r>
+      <w:r>
+        <w:t xml:space="preserve"> </w:t>
+      </w:r>
+      <w:r>
+        <w:t xml:space="preserve">apply</w:t>
+      </w:r>
+      <w:r>
+        <w:t xml:space="preserve"> </w:t>
+      </w:r>
+      <w:r>
+        <w:t xml:space="preserve">inside</w:t>
+      </w:r>
+      <w:r>
+        <w:t xml:space="preserve"> </w:t>
+      </w:r>
+      <w:r>
+        <w:t xml:space="preserve">both</w:t>
+      </w:r>
+      <w:r>
+        <w:t xml:space="preserve"> </w:t>
+      </w:r>
+      <w:r>
+        <w:t xml:space="preserve">indexes</w:t>
+      </w:r>
+      <w:r>
+        <w:t xml:space="preserve"> </w:t>
+      </w:r>
+      <w:r>
+        <w:t xml:space="preserve">rather</w:t>
+      </w:r>
+      <w:r>
+        <w:t xml:space="preserve"> </w:t>
+      </w:r>
+      <w:r>
+        <w:t xml:space="preserve">than</w:t>
+      </w:r>
+      <w:r>
+        <w:t xml:space="preserve"> </w:t>
+      </w:r>
+      <w:r>
+        <w:t xml:space="preserve">after</w:t>
+      </w:r>
+      <w:r>
+        <w:t xml:space="preserve"> </w:t>
+      </w:r>
+      <w:r>
+        <w:t xml:space="preserve">them.</w:t>
+      </w:r>
+      <w:r>
+        <w:t xml:space="preserve"> </w:t>
+      </w:r>
+      <w:r>
         <w:t xml:space="preserve">A</w:t>
       </w:r>
       <w:r>
         <w:t xml:space="preserve"> </w:t>
       </w:r>
       <w:r>
+        <w:t xml:space="preserve">memory</w:t>
+      </w:r>
+      <w:r>
+        <w:t xml:space="preserve"> </w:t>
+      </w:r>
+      <w:r>
+        <w:t xml:space="preserve">layer,</w:t>
+      </w:r>
+      <w:r>
+        <w:t xml:space="preserve"> </w:t>
+      </w:r>
+      <w:r>
+        <w:t xml:space="preserve">served</w:t>
+      </w:r>
+      <w:r>
+        <w:t xml:space="preserve"> </w:t>
+      </w:r>
+      <w:r>
+        <w:t xml:space="preserve">to</w:t>
+      </w:r>
+      <w:r>
+        <w:t xml:space="preserve"> </w:t>
+      </w:r>
+      <w:r>
+        <w:t xml:space="preserve">assistants</w:t>
+      </w:r>
+      <w:r>
+        <w:t xml:space="preserve"> </w:t>
+      </w:r>
+      <w:r>
+        <w:t xml:space="preserve">over</w:t>
+      </w:r>
+      <w:r>
+        <w:t xml:space="preserve"> </w:t>
+      </w:r>
+      <w:r>
+        <w:t xml:space="preserve">the</w:t>
+      </w:r>
+      <w:r>
+        <w:t xml:space="preserve"> </w:t>
+      </w:r>
+      <w:r>
+        <w:t xml:space="preserve">Model</w:t>
+      </w:r>
+      <w:r>
+        <w:t xml:space="preserve"> </w:t>
+      </w:r>
+      <w:r>
+        <w:t xml:space="preserve">Context</w:t>
+      </w:r>
+      <w:r>
+        <w:t xml:space="preserve"> </w:t>
+      </w:r>
+      <w:r>
+        <w:t xml:space="preserve">Protocol</w:t>
+      </w:r>
+      <w:r>
+        <w:t xml:space="preserve"> </w:t>
+      </w:r>
+      <w:r>
+        <w:t xml:space="preserve">(MCP),</w:t>
+      </w:r>
+      <w:r>
+        <w:t xml:space="preserve"> </w:t>
+      </w:r>
+      <w:r>
+        <w:t xml:space="preserve">ranks</w:t>
+      </w:r>
+      <w:r>
+        <w:t xml:space="preserve"> </w:t>
+      </w:r>
+      <w:r>
+        <w:t xml:space="preserve">memories</w:t>
+      </w:r>
+      <w:r>
+        <w:t xml:space="preserve"> </w:t>
+      </w:r>
+      <w:r>
+        <w:t xml:space="preserve">by</w:t>
+      </w:r>
+      <w:r>
+        <w:t xml:space="preserve"> </w:t>
+      </w:r>
+      <w:r>
+        <w:t xml:space="preserve">relevance,</w:t>
+      </w:r>
+      <w:r>
+        <w:t xml:space="preserve"> </w:t>
+      </w:r>
+      <w:r>
+        <w:t xml:space="preserve">importance</w:t>
+      </w:r>
+      <w:r>
+        <w:t xml:space="preserve"> </w:t>
+      </w:r>
+      <w:r>
+        <w:t xml:space="preserve">and</w:t>
+      </w:r>
+      <w:r>
+        <w:t xml:space="preserve"> </w:t>
+      </w:r>
+      <w:r>
+        <w:t xml:space="preserve">recency.</w:t>
+      </w:r>
+      <w:r>
+        <w:t xml:space="preserve"> </w:t>
+      </w:r>
+      <w:r>
+        <w:t xml:space="preserve">We</w:t>
+      </w:r>
+      <w:r>
+        <w:t xml:space="preserve"> </w:t>
+      </w:r>
+      <w:r>
+        <w:t xml:space="preserve">also</w:t>
+      </w:r>
+      <w:r>
+        <w:t xml:space="preserve"> </w:t>
+      </w:r>
+      <w:r>
+        <w:t xml:space="preserve">prove</w:t>
+      </w:r>
+      <w:r>
+        <w:t xml:space="preserve"> </w:t>
+      </w:r>
+      <w:r>
+        <w:t xml:space="preserve">that</w:t>
+      </w:r>
+      <w:r>
+        <w:t xml:space="preserve"> </w:t>
+      </w:r>
+      <w:r>
+        <w:t xml:space="preserve">the</w:t>
+      </w:r>
+      <w:r>
+        <w:t xml:space="preserve"> </w:t>
+      </w:r>
+      <w:r>
+        <w:t xml:space="preserve">previous</w:t>
+      </w:r>
+      <w:r>
+        <w:t xml:space="preserve"> </w:t>
+      </w:r>
+      <w:r>
+        <w:t xml:space="preserve">release’s</w:t>
+      </w:r>
+      <w:r>
+        <w:t xml:space="preserve"> </w:t>
+      </w:r>
+      <w:r>
+        <w:t xml:space="preserve">Grover-inspired</w:t>
+      </w:r>
+      <w:r>
+        <w:t xml:space="preserve"> </w:t>
+      </w:r>
+      <w:r>
+        <w:t xml:space="preserve">reranker</w:t>
+      </w:r>
+      <w:r>
+        <w:t xml:space="preserve"> </w:t>
+      </w:r>
+      <w:r>
+        <w:t xml:space="preserve">applied</w:t>
+      </w:r>
+      <w:r>
+        <w:t xml:space="preserve"> </w:t>
+      </w:r>
+      <w:r>
+        <w:t xml:space="preserve">only</w:t>
+      </w:r>
+      <w:r>
+        <w:t xml:space="preserve"> </w:t>
+      </w:r>
+      <w:r>
+        <w:t xml:space="preserve">the</w:t>
+      </w:r>
+      <w:r>
+        <w:t xml:space="preserve"> </w:t>
+      </w:r>
+      <w:r>
+        <w:t xml:space="preserve">diffusion</w:t>
+      </w:r>
+      <w:r>
+        <w:t xml:space="preserve"> </w:t>
+      </w:r>
+      <w:r>
+        <w:t xml:space="preserve">half</w:t>
+      </w:r>
+      <w:r>
+        <w:t xml:space="preserve"> </w:t>
+      </w:r>
+      <w:r>
+        <w:t xml:space="preserve">of</w:t>
+      </w:r>
+      <w:r>
+        <w:t xml:space="preserve"> </w:t>
+      </w:r>
+      <w:r>
+        <w:t xml:space="preserve">Grover’s</w:t>
+      </w:r>
+      <w:r>
+        <w:t xml:space="preserve"> </w:t>
+      </w:r>
+      <w:r>
+        <w:t xml:space="preserve">algorithm,</w:t>
+      </w:r>
+      <w:r>
+        <w:t xml:space="preserve"> </w:t>
+      </w:r>
+      <w:r>
+        <w:t xml:space="preserve">so</w:t>
+      </w:r>
+      <w:r>
+        <w:t xml:space="preserve"> </w:t>
+      </w:r>
+      <w:r>
+        <w:t xml:space="preserve">it</w:t>
+      </w:r>
+      <w:r>
+        <w:t xml:space="preserve"> </w:t>
+      </w:r>
+      <w:r>
+        <w:t xml:space="preserve">could</w:t>
+      </w:r>
+      <w:r>
+        <w:t xml:space="preserve"> </w:t>
+      </w:r>
+      <w:r>
+        <w:t xml:space="preserve">only</w:t>
+      </w:r>
+      <w:r>
+        <w:t xml:space="preserve"> </w:t>
+      </w:r>
+      <w:r>
+        <w:t xml:space="preserve">keep</w:t>
+      </w:r>
+      <w:r>
+        <w:t xml:space="preserve"> </w:t>
+      </w:r>
+      <w:r>
+        <w:t xml:space="preserve">or</w:t>
+      </w:r>
+      <w:r>
+        <w:t xml:space="preserve"> </w:t>
+      </w:r>
+      <w:r>
+        <w:t xml:space="preserve">reverse</w:t>
+      </w:r>
+      <w:r>
+        <w:t xml:space="preserve"> </w:t>
+      </w:r>
+      <w:r>
+        <w:t xml:space="preserve">a</w:t>
+      </w:r>
+      <w:r>
+        <w:t xml:space="preserve"> </w:t>
+      </w:r>
+      <w:r>
+        <w:t xml:space="preserve">ranking,</w:t>
+      </w:r>
+      <w:r>
+        <w:t xml:space="preserve"> </w:t>
+      </w:r>
+      <w:r>
+        <w:t xml:space="preserve">and</w:t>
+      </w:r>
+      <w:r>
+        <w:t xml:space="preserve"> </w:t>
+      </w:r>
+      <w:r>
+        <w:t xml:space="preserve">replace</w:t>
+      </w:r>
+      <w:r>
+        <w:t xml:space="preserve"> </w:t>
+      </w:r>
+      <w:r>
+        <w:t xml:space="preserve">it</w:t>
+      </w:r>
+      <w:r>
+        <w:t xml:space="preserve"> </w:t>
+      </w:r>
+      <w:r>
+        <w:t xml:space="preserve">with</w:t>
+      </w:r>
+      <w:r>
+        <w:t xml:space="preserve"> </w:t>
+      </w:r>
+      <w:r>
+        <w:t xml:space="preserve">an</w:t>
+      </w:r>
+      <w:r>
+        <w:t xml:space="preserve"> </w:t>
+      </w:r>
+      <w:r>
+        <w:t xml:space="preserve">O(N)</w:t>
+      </w:r>
+      <w:r>
+        <w:t xml:space="preserve"> </w:t>
+      </w:r>
+      <w:r>
+        <w:t xml:space="preserve">closed</w:t>
+      </w:r>
+      <w:r>
+        <w:t xml:space="preserve"> </w:t>
+      </w:r>
+      <w:r>
+        <w:t xml:space="preserve">form</w:t>
+      </w:r>
+      <w:r>
+        <w:t xml:space="preserve"> </w:t>
+      </w:r>
+      <w:r>
+        <w:t xml:space="preserve">of</w:t>
+      </w:r>
+      <w:r>
+        <w:t xml:space="preserve"> </w:t>
+      </w:r>
+      <w:r>
+        <w:t xml:space="preserve">the</w:t>
+      </w:r>
+      <w:r>
+        <w:t xml:space="preserve"> </w:t>
+      </w:r>
+      <w:r>
+        <w:t xml:space="preserve">full</w:t>
+      </w:r>
+      <w:r>
+        <w:t xml:space="preserve"> </w:t>
+      </w:r>
+      <w:r>
+        <w:t xml:space="preserve">algorithm</w:t>
+      </w:r>
+      <w:r>
+        <w:t xml:space="preserve"> </w:t>
+      </w:r>
+      <w:r>
+        <w:t xml:space="preserve">that</w:t>
+      </w:r>
+      <w:r>
+        <w:t xml:space="preserve"> </w:t>
+      </w:r>
+      <w:r>
+        <w:t xml:space="preserve">preserves</w:t>
+      </w:r>
+      <w:r>
+        <w:t xml:space="preserve"> </w:t>
+      </w:r>
+      <w:r>
+        <w:t xml:space="preserve">order</w:t>
+      </w:r>
+      <w:r>
+        <w:t xml:space="preserve"> </w:t>
+      </w:r>
+      <w:r>
+        <w:t xml:space="preserve">inside</w:t>
+      </w:r>
+      <w:r>
+        <w:t xml:space="preserve"> </w:t>
+      </w:r>
+      <w:r>
+        <w:t xml:space="preserve">the</w:t>
+      </w:r>
+      <w:r>
+        <w:t xml:space="preserve"> </w:t>
+      </w:r>
+      <w:r>
+        <w:t xml:space="preserve">marked</w:t>
+      </w:r>
+      <w:r>
+        <w:t xml:space="preserve"> </w:t>
+      </w:r>
+      <w:r>
+        <w:t xml:space="preserve">and</w:t>
+      </w:r>
+      <w:r>
+        <w:t xml:space="preserve"> </w:t>
+      </w:r>
+      <w:r>
+        <w:t xml:space="preserve">unmarked</w:t>
+      </w:r>
+      <w:r>
+        <w:t xml:space="preserve"> </w:t>
+      </w:r>
+      <w:r>
+        <w:t xml:space="preserve">sets.</w:t>
+      </w:r>
+      <w:r>
+        <w:t xml:space="preserve"> </w:t>
+      </w:r>
+      <w:r>
+        <w:t xml:space="preserve">On</w:t>
+      </w:r>
+      <w:r>
+        <w:t xml:space="preserve"> </w:t>
+      </w:r>
+      <w:r>
+        <w:t xml:space="preserve">SciFact</w:t>
+      </w:r>
+      <w:r>
+        <w:t xml:space="preserve"> </w:t>
+      </w:r>
+      <w:r>
+        <w:t xml:space="preserve">with</w:t>
+      </w:r>
+      <w:r>
+        <w:t xml:space="preserve"> </w:t>
+      </w:r>
+      <w:r>
+        <w:t xml:space="preserve">the</w:t>
+      </w:r>
+      <w:r>
+        <w:t xml:space="preserve"> </w:t>
+      </w:r>
+      <w:r>
+        <w:t xml:space="preserve">all-MiniLM-L6-v2</w:t>
+      </w:r>
+      <w:r>
+        <w:t xml:space="preserve"> </w:t>
+      </w:r>
+      <w:r>
+        <w:t xml:space="preserve">encoder,</w:t>
+      </w:r>
+      <w:r>
+        <w:t xml:space="preserve"> </w:t>
+      </w:r>
+      <w:r>
+        <w:t xml:space="preserve">hybrid</w:t>
+      </w:r>
+      <w:r>
+        <w:t xml:space="preserve"> </w:t>
+      </w:r>
+      <w:r>
+        <w:t xml:space="preserve">fusion</w:t>
+      </w:r>
+      <w:r>
+        <w:t xml:space="preserve"> </w:t>
+      </w:r>
+      <w:r>
+        <w:t xml:space="preserve">reaches</w:t>
+      </w:r>
+      <w:r>
+        <w:t xml:space="preserve"> </w:t>
+      </w:r>
+      <w:r>
+        <w:t xml:space="preserve">nDCG@10</w:t>
+      </w:r>
+      <w:r>
+        <w:t xml:space="preserve"> </w:t>
+      </w:r>
+      <w:r>
+        <w:t xml:space="preserve">of</w:t>
+      </w:r>
+      <w:r>
+        <w:t xml:space="preserve"> </w:t>
+      </w:r>
+      <w:r>
+        <w:t xml:space="preserve">0.707</w:t>
+      </w:r>
+      <w:r>
+        <w:t xml:space="preserve"> </w:t>
+      </w:r>
+      <w:r>
+        <w:t xml:space="preserve">against</w:t>
+      </w:r>
+      <w:r>
+        <w:t xml:space="preserve"> </w:t>
+      </w:r>
+      <w:r>
+        <w:t xml:space="preserve">0.645</w:t>
+      </w:r>
+      <w:r>
+        <w:t xml:space="preserve"> </w:t>
+      </w:r>
+      <w:r>
+        <w:t xml:space="preserve">for</w:t>
+      </w:r>
+      <w:r>
+        <w:t xml:space="preserve"> </w:t>
+      </w:r>
+      <w:r>
+        <w:t xml:space="preserve">dense</w:t>
+      </w:r>
+      <w:r>
+        <w:t xml:space="preserve"> </w:t>
+      </w:r>
+      <w:r>
+        <w:t xml:space="preserve">search,</w:t>
+      </w:r>
+      <w:r>
+        <w:t xml:space="preserve"> </w:t>
+      </w:r>
+      <w:r>
+        <w:t xml:space="preserve">0.665</w:t>
+      </w:r>
+      <w:r>
+        <w:t xml:space="preserve"> </w:t>
+      </w:r>
+      <w:r>
+        <w:t xml:space="preserve">for</w:t>
+      </w:r>
+      <w:r>
+        <w:t xml:space="preserve"> </w:t>
+      </w:r>
+      <w:r>
+        <w:t xml:space="preserve">BM25</w:t>
+      </w:r>
+      <w:r>
+        <w:t xml:space="preserve"> </w:t>
+      </w:r>
+      <w:r>
+        <w:t xml:space="preserve">and</w:t>
+      </w:r>
+      <w:r>
+        <w:t xml:space="preserve"> </w:t>
+      </w:r>
+      <w:r>
+        <w:t xml:space="preserve">0.681</w:t>
+      </w:r>
+      <w:r>
+        <w:t xml:space="preserve"> </w:t>
+      </w:r>
+      <w:r>
+        <w:t xml:space="preserve">for</w:t>
+      </w:r>
+      <w:r>
+        <w:t xml:space="preserve"> </w:t>
+      </w:r>
+      <w:r>
+        <w:t xml:space="preserve">reciprocal</w:t>
+      </w:r>
+      <w:r>
+        <w:t xml:space="preserve"> </w:t>
+      </w:r>
+      <w:r>
+        <w:t xml:space="preserve">rank</w:t>
+      </w:r>
+      <w:r>
+        <w:t xml:space="preserve"> </w:t>
+      </w:r>
+      <w:r>
+        <w:t xml:space="preserve">fusion;</w:t>
+      </w:r>
+      <w:r>
+        <w:t xml:space="preserve"> </w:t>
+      </w:r>
+      <w:r>
+        <w:t xml:space="preserve">all</w:t>
+      </w:r>
+      <w:r>
+        <w:t xml:space="preserve"> </w:t>
+      </w:r>
+      <w:r>
+        <w:t xml:space="preserve">differences</w:t>
+      </w:r>
+      <w:r>
+        <w:t xml:space="preserve"> </w:t>
+      </w:r>
+      <w:r>
+        <w:t xml:space="preserve">are</w:t>
+      </w:r>
+      <w:r>
+        <w:t xml:space="preserve"> </w:t>
+      </w:r>
+      <w:r>
+        <w:t xml:space="preserve">significant</w:t>
+      </w:r>
+      <w:r>
+        <w:t xml:space="preserve"> </w:t>
+      </w:r>
+      <w:r>
+        <w:t xml:space="preserve">(p</w:t>
+      </w:r>
+      <w:r>
+        <w:t xml:space="preserve"> </w:t>
+      </w:r>
+      <w:r>
+        <w:t xml:space="preserve">&lt;</w:t>
+      </w:r>
+      <w:r>
+        <w:t xml:space="preserve"> </w:t>
+      </w:r>
+      <w:r>
+        <w:t xml:space="preserve">0.001).</w:t>
+      </w:r>
+      <w:r>
+        <w:t xml:space="preserve"> </w:t>
+      </w:r>
+      <w:r>
+        <w:t xml:space="preserve">Against</w:t>
+      </w:r>
+      <w:r>
+        <w:t xml:space="preserve"> </w:t>
+      </w:r>
+      <w:r>
+        <w:t xml:space="preserve">the</w:t>
+      </w:r>
+      <w:r>
+        <w:t xml:space="preserve"> </w:t>
+      </w:r>
+      <w:r>
+        <w:t xml:space="preserve">1.x</w:t>
+      </w:r>
+      <w:r>
+        <w:t xml:space="preserve"> </w:t>
+      </w:r>
+      <w:r>
+        <w:t xml:space="preserve">code,</w:t>
+      </w:r>
+      <w:r>
+        <w:t xml:space="preserve"> </w:t>
+      </w:r>
+      <w:r>
+        <w:t xml:space="preserve">in-index</w:t>
+      </w:r>
+      <w:r>
+        <w:t xml:space="preserve"> </w:t>
+      </w:r>
+      <w:r>
+        <w:t xml:space="preserve">constraints</w:t>
+      </w:r>
+      <w:r>
+        <w:t xml:space="preserve"> </w:t>
+      </w:r>
+      <w:r>
+        <w:t xml:space="preserve">raise</w:t>
+      </w:r>
+      <w:r>
+        <w:t xml:space="preserve"> </w:t>
+      </w:r>
+      <w:r>
+        <w:t xml:space="preserve">recall</w:t>
+      </w:r>
+      <w:r>
+        <w:t xml:space="preserve"> </w:t>
+      </w:r>
+      <w:r>
+        <w:t xml:space="preserve">in</w:t>
+      </w:r>
+      <w:r>
+        <w:t xml:space="preserve"> </w:t>
+      </w:r>
+      <w:r>
+        <w:t xml:space="preserve">small</w:t>
+      </w:r>
+      <w:r>
+        <w:t xml:space="preserve"> </w:t>
+      </w:r>
+      <w:r>
+        <w:t xml:space="preserve">namespaces</w:t>
+      </w:r>
+      <w:r>
+        <w:t xml:space="preserve"> </w:t>
+      </w:r>
+      <w:r>
+        <w:t xml:space="preserve">from</w:t>
+      </w:r>
+      <w:r>
+        <w:t xml:space="preserve"> </w:t>
+      </w:r>
+      <w:r>
+        <w:t xml:space="preserve">0.5%</w:t>
+      </w:r>
+      <w:r>
+        <w:t xml:space="preserve"> </w:t>
+      </w:r>
+      <w:r>
+        <w:t xml:space="preserve">to</w:t>
+      </w:r>
+      <w:r>
+        <w:t xml:space="preserve"> </w:t>
+      </w:r>
+      <w:r>
+        <w:t xml:space="preserve">100%,</w:t>
+      </w:r>
+      <w:r>
+        <w:t xml:space="preserve"> </w:t>
+      </w:r>
+      <w:r>
+        <w:t xml:space="preserve">incremental</w:t>
+      </w:r>
+      <w:r>
+        <w:t xml:space="preserve"> </w:t>
+      </w:r>
+      <w:r>
+        <w:t xml:space="preserve">indexing</w:t>
+      </w:r>
+      <w:r>
+        <w:t xml:space="preserve"> </w:t>
+      </w:r>
+      <w:r>
+        <w:t xml:space="preserve">makes</w:t>
+      </w:r>
+      <w:r>
+        <w:t xml:space="preserve"> </w:t>
+      </w:r>
+      <w:r>
+        <w:t xml:space="preserve">insertion</w:t>
+      </w:r>
+      <w:r>
+        <w:t xml:space="preserve"> </w:t>
+      </w:r>
+      <w:r>
+        <w:t xml:space="preserve">183</w:t>
+      </w:r>
+      <w:r>
+        <w:t xml:space="preserve"> </w:t>
+      </w:r>
+      <w:r>
+        <w:t xml:space="preserve">times</w:t>
+      </w:r>
+      <w:r>
+        <w:t xml:space="preserve"> </w:t>
+      </w:r>
+      <w:r>
+        <w:t xml:space="preserve">faster,</w:t>
+      </w:r>
+      <w:r>
+        <w:t xml:space="preserve"> </w:t>
+      </w:r>
+      <w:r>
+        <w:t xml:space="preserve">and</w:t>
+      </w:r>
+      <w:r>
+        <w:t xml:space="preserve"> </w:t>
+      </w:r>
+      <w:r>
+        <w:t xml:space="preserve">snapshots</w:t>
+      </w:r>
+      <w:r>
+        <w:t xml:space="preserve"> </w:t>
+      </w:r>
+      <w:r>
+        <w:t xml:space="preserve">make</w:t>
+      </w:r>
+      <w:r>
+        <w:t xml:space="preserve"> </w:t>
+      </w:r>
+      <w:r>
+        <w:t xml:space="preserve">reopening</w:t>
+      </w:r>
+      <w:r>
+        <w:t xml:space="preserve"> </w:t>
+      </w:r>
+      <w:r>
+        <w:t xml:space="preserve">9</w:t>
+      </w:r>
+      <w:r>
+        <w:t xml:space="preserve"> </w:t>
+      </w:r>
+      <w:r>
+        <w:t xml:space="preserve">to</w:t>
+      </w:r>
+      <w:r>
+        <w:t xml:space="preserve"> </w:t>
+      </w:r>
+      <w:r>
+        <w:t xml:space="preserve">17</w:t>
+      </w:r>
+      <w:r>
+        <w:t xml:space="preserve"> </w:t>
+      </w:r>
+      <w:r>
+        <w:t xml:space="preserve">times</w:t>
+      </w:r>
+      <w:r>
+        <w:t xml:space="preserve"> </w:t>
+      </w:r>
+      <w:r>
+        <w:t xml:space="preserve">faster.</w:t>
+      </w:r>
+      <w:r>
+        <w:t xml:space="preserve"> </w:t>
+      </w:r>
+      <w:r>
+        <w:t xml:space="preserve">Encryption,</w:t>
+      </w:r>
+      <w:r>
+        <w:t xml:space="preserve"> </w:t>
+      </w:r>
+      <w:r>
+        <w:t xml:space="preserve">audit</w:t>
+      </w:r>
+      <w:r>
+        <w:t xml:space="preserve"> </w:t>
+      </w:r>
+      <w:r>
+        <w:t xml:space="preserve">logging</w:t>
+      </w:r>
+      <w:r>
+        <w:t xml:space="preserve"> </w:t>
+      </w:r>
+      <w:r>
+        <w:t xml:space="preserve">and</w:t>
+      </w:r>
+      <w:r>
+        <w:t xml:space="preserve"> </w:t>
+      </w:r>
+      <w:r>
+        <w:t xml:space="preserve">access</w:t>
+      </w:r>
+      <w:r>
+        <w:t xml:space="preserve"> </w:t>
+      </w:r>
+      <w:r>
+        <w:t xml:space="preserve">control</w:t>
+      </w:r>
+      <w:r>
+        <w:t xml:space="preserve"> </w:t>
+      </w:r>
+      <w:r>
+        <w:t xml:space="preserve">add</w:t>
+      </w:r>
+      <w:r>
+        <w:t xml:space="preserve"> </w:t>
+      </w:r>
+      <w:r>
+        <w:t xml:space="preserve">little</w:t>
+      </w:r>
+      <w:r>
+        <w:t xml:space="preserve"> </w:t>
+      </w:r>
+      <w:r>
+        <w:t xml:space="preserve">measurable</w:t>
+      </w:r>
+      <w:r>
+        <w:t xml:space="preserve"> </w:t>
+      </w:r>
+      <w:r>
+        <w:t xml:space="preserve">cost.</w:t>
+      </w:r>
+      <w:r>
+        <w:t xml:space="preserve"> </w:t>
+      </w:r>
+      <w:r>
+        <w:t xml:space="preserve">We</w:t>
+      </w:r>
+      <w:r>
+        <w:t xml:space="preserve"> </w:t>
+      </w:r>
+      <w:r>
+        <w:t xml:space="preserve">also</w:t>
+      </w:r>
+      <w:r>
+        <w:t xml:space="preserve"> </w:t>
+      </w:r>
+      <w:r>
+        <w:t xml:space="preserve">report</w:t>
+      </w:r>
+      <w:r>
+        <w:t xml:space="preserve"> </w:t>
+      </w:r>
+      <w:r>
+        <w:t xml:space="preserve">negative</w:t>
+      </w:r>
+      <w:r>
+        <w:t xml:space="preserve"> </w:t>
+      </w:r>
+      <w:r>
+        <w:t xml:space="preserve">results:</w:t>
+      </w:r>
+      <w:r>
+        <w:t xml:space="preserve"> </w:t>
+      </w:r>
+      <w:r>
+        <w:t xml:space="preserve">the</w:t>
+      </w:r>
+      <w:r>
+        <w:t xml:space="preserve"> </w:t>
+      </w:r>
+      <w:r>
+        <w:t xml:space="preserve">Grover</w:t>
+      </w:r>
+      <w:r>
+        <w:t xml:space="preserve"> </w:t>
+      </w:r>
+      <w:r>
+        <w:t xml:space="preserve">consensus</w:t>
+      </w:r>
+      <w:r>
+        <w:t xml:space="preserve"> </w:t>
+      </w:r>
+      <w:r>
+        <w:t xml:space="preserve">oracle</w:t>
+      </w:r>
+      <w:r>
+        <w:t xml:space="preserve"> </w:t>
+      </w:r>
+      <w:r>
+        <w:t xml:space="preserve">does</w:t>
+      </w:r>
+      <w:r>
+        <w:t xml:space="preserve"> </w:t>
+      </w:r>
+      <w:r>
+        <w:t xml:space="preserve">not</w:t>
+      </w:r>
+      <w:r>
+        <w:t xml:space="preserve"> </w:t>
+      </w:r>
+      <w:r>
+        <w:t xml:space="preserve">change</w:t>
+      </w:r>
+      <w:r>
+        <w:t xml:space="preserve"> </w:t>
+      </w:r>
+      <w:r>
+        <w:t xml:space="preserve">nDCG</w:t>
+      </w:r>
+      <w:r>
+        <w:t xml:space="preserve"> </w:t>
+      </w:r>
+      <w:r>
+        <w:t xml:space="preserve">on</w:t>
+      </w:r>
+      <w:r>
+        <w:t xml:space="preserve"> </w:t>
+      </w:r>
+      <w:r>
+        <w:t xml:space="preserve">SciFact,</w:t>
+      </w:r>
+      <w:r>
+        <w:t xml:space="preserve"> </w:t>
+      </w:r>
+      <w:r>
+        <w:t xml:space="preserve">filters</w:t>
+      </w:r>
+      <w:r>
+        <w:t xml:space="preserve"> </w:t>
+      </w:r>
+      <w:r>
+        <w:t xml:space="preserve">that</w:t>
+      </w:r>
+      <w:r>
+        <w:t xml:space="preserve"> </w:t>
+      </w:r>
+      <w:r>
+        <w:t xml:space="preserve">pass</w:t>
+      </w:r>
+      <w:r>
+        <w:t xml:space="preserve"> </w:t>
+      </w:r>
+      <w:r>
+        <w:t xml:space="preserve">0.1%</w:t>
+      </w:r>
+      <w:r>
+        <w:t xml:space="preserve"> </w:t>
+      </w:r>
+      <w:r>
+        <w:t xml:space="preserve">of</w:t>
+      </w:r>
+      <w:r>
+        <w:t xml:space="preserve"> </w:t>
+      </w:r>
+      <w:r>
+        <w:t xml:space="preserve">documents</w:t>
+      </w:r>
+      <w:r>
+        <w:t xml:space="preserve"> </w:t>
+      </w:r>
+      <w:r>
+        <w:t xml:space="preserve">are</w:t>
+      </w:r>
+      <w:r>
+        <w:t xml:space="preserve"> </w:t>
+      </w:r>
+      <w:r>
+        <w:t xml:space="preserve">slow,</w:t>
+      </w:r>
+      <w:r>
+        <w:t xml:space="preserve"> </w:t>
+      </w:r>
+      <w:r>
+        <w:t xml:space="preserve">cosine-based</w:t>
+      </w:r>
+      <w:r>
+        <w:t xml:space="preserve"> </w:t>
+      </w:r>
+      <w:r>
+        <w:t xml:space="preserve">memory</w:t>
+      </w:r>
+      <w:r>
+        <w:t xml:space="preserve"> </w:t>
+      </w:r>
+      <w:r>
+        <w:t xml:space="preserve">deduplication</w:t>
+      </w:r>
+      <w:r>
+        <w:t xml:space="preserve"> </w:t>
+      </w:r>
+      <w:r>
+        <w:t xml:space="preserve">cannot</w:t>
+      </w:r>
+      <w:r>
+        <w:t xml:space="preserve"> </w:t>
+      </w:r>
+      <w:r>
+        <w:t xml:space="preserve">separate</w:t>
+      </w:r>
+      <w:r>
+        <w:t xml:space="preserve"> </w:t>
+      </w:r>
+      <w:r>
+        <w:t xml:space="preserve">paraphrases</w:t>
+      </w:r>
+      <w:r>
+        <w:t xml:space="preserve"> </w:t>
+      </w:r>
+      <w:r>
+        <w:t xml:space="preserve">from</w:t>
+      </w:r>
+      <w:r>
+        <w:t xml:space="preserve"> </w:t>
+      </w:r>
+      <w:r>
+        <w:t xml:space="preserve">statements</w:t>
+      </w:r>
+      <w:r>
+        <w:t xml:space="preserve"> </w:t>
+      </w:r>
+      <w:r>
+        <w:t xml:space="preserve">that</w:t>
+      </w:r>
+      <w:r>
+        <w:t xml:space="preserve"> </w:t>
+      </w:r>
+      <w:r>
+        <w:t xml:space="preserve">differ</w:t>
+      </w:r>
+      <w:r>
+        <w:t xml:space="preserve"> </w:t>
+      </w:r>
+      <w:r>
+        <w:t xml:space="preserve">in</w:t>
+      </w:r>
+      <w:r>
+        <w:t xml:space="preserve"> </w:t>
+      </w:r>
+      <w:r>
+        <w:t xml:space="preserve">a</w:t>
+      </w:r>
+      <w:r>
+        <w:t xml:space="preserve"> </w:t>
+      </w:r>
+      <w:r>
         <w:t xml:space="preserve">single</w:t>
       </w:r>
       <w:r>
         <w:t xml:space="preserve"> </w:t>
       </w:r>
       <w:r>
-        <w:t xml:space="preserve">SQLite</w:t>
-      </w:r>
-      <w:r>
-        <w:t xml:space="preserve"> </w:t>
-      </w:r>
-      <w:r>
-        <w:t xml:space="preserve">file,</w:t>
-      </w:r>
-      <w:r>
-        <w:t xml:space="preserve"> </w:t>
-      </w:r>
-      <w:r>
-        <w:t xml:space="preserve">optionally</w:t>
-      </w:r>
-      <w:r>
-        <w:t xml:space="preserve"> </w:t>
-      </w:r>
-      <w:r>
-        <w:t xml:space="preserve">encrypted</w:t>
-      </w:r>
-      <w:r>
-        <w:t xml:space="preserve"> </w:t>
-      </w:r>
-      <w:r>
-        <w:t xml:space="preserve">with</w:t>
-      </w:r>
-      <w:r>
-        <w:t xml:space="preserve"> </w:t>
-      </w:r>
-      <w:r>
-        <w:t xml:space="preserve">SQLCipher,</w:t>
-      </w:r>
-      <w:r>
-        <w:t xml:space="preserve"> </w:t>
-      </w:r>
-      <w:r>
-        <w:t xml:space="preserve">holds</w:t>
-      </w:r>
-      <w:r>
-        <w:t xml:space="preserve"> </w:t>
-      </w:r>
-      <w:r>
-        <w:t xml:space="preserve">documents,</w:t>
-      </w:r>
-      <w:r>
-        <w:t xml:space="preserve"> </w:t>
-      </w:r>
-      <w:r>
-        <w:t xml:space="preserve">vectors,</w:t>
-      </w:r>
-      <w:r>
-        <w:t xml:space="preserve"> </w:t>
-      </w:r>
-      <w:r>
-        <w:t xml:space="preserve">metadata,</w:t>
-      </w:r>
-      <w:r>
-        <w:t xml:space="preserve"> </w:t>
-      </w:r>
-      <w:r>
-        <w:t xml:space="preserve">access</w:t>
-      </w:r>
-      <w:r>
-        <w:t xml:space="preserve"> </w:t>
-      </w:r>
-      <w:r>
-        <w:t xml:space="preserve">keys,</w:t>
-      </w:r>
-      <w:r>
-        <w:t xml:space="preserve"> </w:t>
-      </w:r>
-      <w:r>
-        <w:t xml:space="preserve">agent</w:t>
-      </w:r>
-      <w:r>
-        <w:t xml:space="preserve"> </w:t>
-      </w:r>
-      <w:r>
-        <w:t xml:space="preserve">sessions</w:t>
+        <w:t xml:space="preserve">value,</w:t>
       </w:r>
       <w:r>
         <w:t xml:space="preserve"> </w:t>
@@ -549,79 +1749,61 @@
         <w:t xml:space="preserve"> </w:t>
       </w:r>
       <w:r>
-        <w:t xml:space="preserve">serialised</w:t>
-      </w:r>
-      <w:r>
-        <w:t xml:space="preserve"> </w:t>
-      </w:r>
-      <w:r>
-        <w:t xml:space="preserve">index</w:t>
-      </w:r>
-      <w:r>
-        <w:t xml:space="preserve"> </w:t>
-      </w:r>
-      <w:r>
-        <w:t xml:space="preserve">snapshots.</w:t>
-      </w:r>
-      <w:r>
-        <w:t xml:space="preserve"> </w:t>
-      </w:r>
-      <w:r>
-        <w:t xml:space="preserve">Queries</w:t>
-      </w:r>
-      <w:r>
-        <w:t xml:space="preserve"> </w:t>
-      </w:r>
-      <w:r>
-        <w:t xml:space="preserve">fuse</w:t>
-      </w:r>
-      <w:r>
-        <w:t xml:space="preserve"> </w:t>
-      </w:r>
-      <w:r>
-        <w:t xml:space="preserve">FAISS</w:t>
-      </w:r>
-      <w:r>
-        <w:t xml:space="preserve"> </w:t>
-      </w:r>
-      <w:r>
-        <w:t xml:space="preserve">dense</w:t>
-      </w:r>
-      <w:r>
-        <w:t xml:space="preserve"> </w:t>
-      </w:r>
-      <w:r>
-        <w:t xml:space="preserve">search</w:t>
-      </w:r>
-      <w:r>
-        <w:t xml:space="preserve"> </w:t>
-      </w:r>
-      <w:r>
-        <w:t xml:space="preserve">with</w:t>
-      </w:r>
-      <w:r>
-        <w:t xml:space="preserve"> </w:t>
-      </w:r>
-      <w:r>
-        <w:t xml:space="preserve">an</w:t>
-      </w:r>
-      <w:r>
-        <w:t xml:space="preserve"> </w:t>
-      </w:r>
-      <w:r>
-        <w:t xml:space="preserve">incremental</w:t>
-      </w:r>
-      <w:r>
-        <w:t xml:space="preserve"> </w:t>
-      </w:r>
-      <w:r>
-        <w:t xml:space="preserve">BM25</w:t>
-      </w:r>
-      <w:r>
-        <w:t xml:space="preserve"> </w:t>
-      </w:r>
-      <w:r>
-        <w:t xml:space="preserve">index,</w:t>
+        <w:t xml:space="preserve">query</w:t>
+      </w:r>
+      <w:r>
+        <w:t xml:space="preserve"> </w:t>
+      </w:r>
+      <w:r>
+        <w:t xml:space="preserve">throughput</w:t>
+      </w:r>
+      <w:r>
+        <w:t xml:space="preserve"> </w:t>
+      </w:r>
+      <w:r>
+        <w:t xml:space="preserve">stops</w:t>
+      </w:r>
+      <w:r>
+        <w:t xml:space="preserve"> </w:t>
+      </w:r>
+      <w:r>
+        <w:t xml:space="preserve">growing</w:t>
+      </w:r>
+      <w:r>
+        <w:t xml:space="preserve"> </w:t>
+      </w:r>
+      <w:r>
+        <w:t xml:space="preserve">beyond</w:t>
+      </w:r>
+      <w:r>
+        <w:t xml:space="preserve"> </w:t>
+      </w:r>
+      <w:r>
+        <w:t xml:space="preserve">two</w:t>
+      </w:r>
+      <w:r>
+        <w:t xml:space="preserve"> </w:t>
+      </w:r>
+      <w:r>
+        <w:t xml:space="preserve">threads.</w:t>
+      </w:r>
+      <w:r>
+        <w:t xml:space="preserve"> </w:t>
+      </w:r>
+      <w:r>
+        <w:t xml:space="preserve">The</w:t>
+      </w:r>
+      <w:r>
+        <w:t xml:space="preserve"> </w:t>
+      </w:r>
+      <w:r>
+        <w:t xml:space="preserve">system,</w:t>
+      </w:r>
+      <w:r>
+        <w:t xml:space="preserve"> </w:t>
+      </w:r>
+      <w:r>
+        <w:t xml:space="preserve">experiments</w:t>
       </w:r>
       <w:r>
         <w:t xml:space="preserve"> </w:t>
@@ -633,25 +1815,13 @@
         <w:t xml:space="preserve"> </w:t>
       </w:r>
       <w:r>
-        <w:t xml:space="preserve">namespace</w:t>
-      </w:r>
-      <w:r>
-        <w:t xml:space="preserve"> </w:t>
-      </w:r>
-      <w:r>
-        <w:t xml:space="preserve">and</w:t>
-      </w:r>
-      <w:r>
-        <w:t xml:space="preserve"> </w:t>
-      </w:r>
-      <w:r>
-        <w:t xml:space="preserve">deletion</w:t>
-      </w:r>
-      <w:r>
-        <w:t xml:space="preserve"> </w:t>
-      </w:r>
-      <w:r>
-        <w:t xml:space="preserve">constraints</w:t>
+        <w:t xml:space="preserve">data</w:t>
+      </w:r>
+      <w:r>
+        <w:t xml:space="preserve"> </w:t>
+      </w:r>
+      <w:r>
+        <w:t xml:space="preserve">generators</w:t>
       </w:r>
       <w:r>
         <w:t xml:space="preserve"> </w:t>
@@ -663,1255 +1833,7 @@
         <w:t xml:space="preserve"> </w:t>
       </w:r>
       <w:r>
-        <w:t xml:space="preserve">applied</w:t>
-      </w:r>
-      <w:r>
-        <w:t xml:space="preserve"> </w:t>
-      </w:r>
-      <w:r>
-        <w:t xml:space="preserve">inside</w:t>
-      </w:r>
-      <w:r>
-        <w:t xml:space="preserve"> </w:t>
-      </w:r>
-      <w:r>
-        <w:t xml:space="preserve">both</w:t>
-      </w:r>
-      <w:r>
-        <w:t xml:space="preserve"> </w:t>
-      </w:r>
-      <w:r>
-        <w:t xml:space="preserve">indexes</w:t>
-      </w:r>
-      <w:r>
-        <w:t xml:space="preserve"> </w:t>
-      </w:r>
-      <w:r>
-        <w:t xml:space="preserve">rather</w:t>
-      </w:r>
-      <w:r>
-        <w:t xml:space="preserve"> </w:t>
-      </w:r>
-      <w:r>
-        <w:t xml:space="preserve">than</w:t>
-      </w:r>
-      <w:r>
-        <w:t xml:space="preserve"> </w:t>
-      </w:r>
-      <w:r>
-        <w:t xml:space="preserve">after</w:t>
-      </w:r>
-      <w:r>
-        <w:t xml:space="preserve"> </w:t>
-      </w:r>
-      <w:r>
-        <w:t xml:space="preserve">them.</w:t>
-      </w:r>
-      <w:r>
-        <w:t xml:space="preserve"> </w:t>
-      </w:r>
-      <w:r>
-        <w:t xml:space="preserve">A</w:t>
-      </w:r>
-      <w:r>
-        <w:t xml:space="preserve"> </w:t>
-      </w:r>
-      <w:r>
-        <w:t xml:space="preserve">memory</w:t>
-      </w:r>
-      <w:r>
-        <w:t xml:space="preserve"> </w:t>
-      </w:r>
-      <w:r>
-        <w:t xml:space="preserve">layer,</w:t>
-      </w:r>
-      <w:r>
-        <w:t xml:space="preserve"> </w:t>
-      </w:r>
-      <w:r>
-        <w:t xml:space="preserve">served</w:t>
-      </w:r>
-      <w:r>
-        <w:t xml:space="preserve"> </w:t>
-      </w:r>
-      <w:r>
-        <w:t xml:space="preserve">to</w:t>
-      </w:r>
-      <w:r>
-        <w:t xml:space="preserve"> </w:t>
-      </w:r>
-      <w:r>
-        <w:t xml:space="preserve">assistants</w:t>
-      </w:r>
-      <w:r>
-        <w:t xml:space="preserve"> </w:t>
-      </w:r>
-      <w:r>
-        <w:t xml:space="preserve">over</w:t>
-      </w:r>
-      <w:r>
-        <w:t xml:space="preserve"> </w:t>
-      </w:r>
-      <w:r>
-        <w:t xml:space="preserve">the</w:t>
-      </w:r>
-      <w:r>
-        <w:t xml:space="preserve"> </w:t>
-      </w:r>
-      <w:r>
-        <w:t xml:space="preserve">Model</w:t>
-      </w:r>
-      <w:r>
-        <w:t xml:space="preserve"> </w:t>
-      </w:r>
-      <w:r>
-        <w:t xml:space="preserve">Context</w:t>
-      </w:r>
-      <w:r>
-        <w:t xml:space="preserve"> </w:t>
-      </w:r>
-      <w:r>
-        <w:t xml:space="preserve">Protocol</w:t>
-      </w:r>
-      <w:r>
-        <w:t xml:space="preserve"> </w:t>
-      </w:r>
-      <w:r>
-        <w:t xml:space="preserve">(MCP),</w:t>
-      </w:r>
-      <w:r>
-        <w:t xml:space="preserve"> </w:t>
-      </w:r>
-      <w:r>
-        <w:t xml:space="preserve">ranks</w:t>
-      </w:r>
-      <w:r>
-        <w:t xml:space="preserve"> </w:t>
-      </w:r>
-      <w:r>
-        <w:t xml:space="preserve">memories</w:t>
-      </w:r>
-      <w:r>
-        <w:t xml:space="preserve"> </w:t>
-      </w:r>
-      <w:r>
-        <w:t xml:space="preserve">by</w:t>
-      </w:r>
-      <w:r>
-        <w:t xml:space="preserve"> </w:t>
-      </w:r>
-      <w:r>
-        <w:t xml:space="preserve">relevance,</w:t>
-      </w:r>
-      <w:r>
-        <w:t xml:space="preserve"> </w:t>
-      </w:r>
-      <w:r>
-        <w:t xml:space="preserve">importance</w:t>
-      </w:r>
-      <w:r>
-        <w:t xml:space="preserve"> </w:t>
-      </w:r>
-      <w:r>
-        <w:t xml:space="preserve">and</w:t>
-      </w:r>
-      <w:r>
-        <w:t xml:space="preserve"> </w:t>
-      </w:r>
-      <w:r>
-        <w:t xml:space="preserve">recency.</w:t>
-      </w:r>
-      <w:r>
-        <w:t xml:space="preserve"> </w:t>
-      </w:r>
-      <w:r>
-        <w:t xml:space="preserve">We</w:t>
-      </w:r>
-      <w:r>
-        <w:t xml:space="preserve"> </w:t>
-      </w:r>
-      <w:r>
-        <w:t xml:space="preserve">also</w:t>
-      </w:r>
-      <w:r>
-        <w:t xml:space="preserve"> </w:t>
-      </w:r>
-      <w:r>
-        <w:t xml:space="preserve">analyse</w:t>
-      </w:r>
-      <w:r>
-        <w:t xml:space="preserve"> </w:t>
-      </w:r>
-      <w:r>
-        <w:t xml:space="preserve">the</w:t>
-      </w:r>
-      <w:r>
-        <w:t xml:space="preserve"> </w:t>
-      </w:r>
-      <w:r>
-        <w:t xml:space="preserve">Grover-inspired</w:t>
-      </w:r>
-      <w:r>
-        <w:t xml:space="preserve"> </w:t>
-      </w:r>
-      <w:r>
-        <w:t xml:space="preserve">reranker</w:t>
-      </w:r>
-      <w:r>
-        <w:t xml:space="preserve"> </w:t>
-      </w:r>
-      <w:r>
-        <w:t xml:space="preserve">of</w:t>
-      </w:r>
-      <w:r>
-        <w:t xml:space="preserve"> </w:t>
-      </w:r>
-      <w:r>
-        <w:t xml:space="preserve">the</w:t>
-      </w:r>
-      <w:r>
-        <w:t xml:space="preserve"> </w:t>
-      </w:r>
-      <w:r>
-        <w:t xml:space="preserve">previous</w:t>
-      </w:r>
-      <w:r>
-        <w:t xml:space="preserve"> </w:t>
-      </w:r>
-      <w:r>
-        <w:t xml:space="preserve">release,</w:t>
-      </w:r>
-      <w:r>
-        <w:t xml:space="preserve"> </w:t>
-      </w:r>
-      <w:r>
-        <w:t xml:space="preserve">prove</w:t>
-      </w:r>
-      <w:r>
-        <w:t xml:space="preserve"> </w:t>
-      </w:r>
-      <w:r>
-        <w:t xml:space="preserve">that</w:t>
-      </w:r>
-      <w:r>
-        <w:t xml:space="preserve"> </w:t>
-      </w:r>
-      <w:r>
-        <w:t xml:space="preserve">it</w:t>
-      </w:r>
-      <w:r>
-        <w:t xml:space="preserve"> </w:t>
-      </w:r>
-      <w:r>
-        <w:t xml:space="preserve">applied</w:t>
-      </w:r>
-      <w:r>
-        <w:t xml:space="preserve"> </w:t>
-      </w:r>
-      <w:r>
-        <w:t xml:space="preserve">only</w:t>
-      </w:r>
-      <w:r>
-        <w:t xml:space="preserve"> </w:t>
-      </w:r>
-      <w:r>
-        <w:t xml:space="preserve">the</w:t>
-      </w:r>
-      <w:r>
-        <w:t xml:space="preserve"> </w:t>
-      </w:r>
-      <w:r>
-        <w:t xml:space="preserve">diffusion</w:t>
-      </w:r>
-      <w:r>
-        <w:t xml:space="preserve"> </w:t>
-      </w:r>
-      <w:r>
-        <w:t xml:space="preserve">half</w:t>
-      </w:r>
-      <w:r>
-        <w:t xml:space="preserve"> </w:t>
-      </w:r>
-      <w:r>
-        <w:t xml:space="preserve">of</w:t>
-      </w:r>
-      <w:r>
-        <w:t xml:space="preserve"> </w:t>
-      </w:r>
-      <w:r>
-        <w:t xml:space="preserve">Grover’s</w:t>
-      </w:r>
-      <w:r>
-        <w:t xml:space="preserve"> </w:t>
-      </w:r>
-      <w:r>
-        <w:t xml:space="preserve">algorithm</w:t>
-      </w:r>
-      <w:r>
-        <w:t xml:space="preserve"> </w:t>
-      </w:r>
-      <w:r>
-        <w:t xml:space="preserve">and</w:t>
-      </w:r>
-      <w:r>
-        <w:t xml:space="preserve"> </w:t>
-      </w:r>
-      <w:r>
-        <w:t xml:space="preserve">could</w:t>
-      </w:r>
-      <w:r>
-        <w:t xml:space="preserve"> </w:t>
-      </w:r>
-      <w:r>
-        <w:t xml:space="preserve">therefore</w:t>
-      </w:r>
-      <w:r>
-        <w:t xml:space="preserve"> </w:t>
-      </w:r>
-      <w:r>
-        <w:t xml:space="preserve">only</w:t>
-      </w:r>
-      <w:r>
-        <w:t xml:space="preserve"> </w:t>
-      </w:r>
-      <w:r>
-        <w:t xml:space="preserve">keep</w:t>
-      </w:r>
-      <w:r>
-        <w:t xml:space="preserve"> </w:t>
-      </w:r>
-      <w:r>
-        <w:t xml:space="preserve">or</w:t>
-      </w:r>
-      <w:r>
-        <w:t xml:space="preserve"> </w:t>
-      </w:r>
-      <w:r>
-        <w:t xml:space="preserve">reverse</w:t>
-      </w:r>
-      <w:r>
-        <w:t xml:space="preserve"> </w:t>
-      </w:r>
-      <w:r>
-        <w:t xml:space="preserve">a</w:t>
-      </w:r>
-      <w:r>
-        <w:t xml:space="preserve"> </w:t>
-      </w:r>
-      <w:r>
-        <w:t xml:space="preserve">ranking,</w:t>
-      </w:r>
-      <w:r>
-        <w:t xml:space="preserve"> </w:t>
-      </w:r>
-      <w:r>
-        <w:t xml:space="preserve">and</w:t>
-      </w:r>
-      <w:r>
-        <w:t xml:space="preserve"> </w:t>
-      </w:r>
-      <w:r>
-        <w:t xml:space="preserve">replace</w:t>
-      </w:r>
-      <w:r>
-        <w:t xml:space="preserve"> </w:t>
-      </w:r>
-      <w:r>
-        <w:t xml:space="preserve">it</w:t>
-      </w:r>
-      <w:r>
-        <w:t xml:space="preserve"> </w:t>
-      </w:r>
-      <w:r>
-        <w:t xml:space="preserve">with</w:t>
-      </w:r>
-      <w:r>
-        <w:t xml:space="preserve"> </w:t>
-      </w:r>
-      <w:r>
-        <w:t xml:space="preserve">an</w:t>
-      </w:r>
-      <w:r>
-        <w:t xml:space="preserve"> </w:t>
-      </w:r>
-      <w:r>
-        <w:t xml:space="preserve">O(N)</w:t>
-      </w:r>
-      <w:r>
-        <w:t xml:space="preserve"> </w:t>
-      </w:r>
-      <w:r>
-        <w:t xml:space="preserve">closed</w:t>
-      </w:r>
-      <w:r>
-        <w:t xml:space="preserve"> </w:t>
-      </w:r>
-      <w:r>
-        <w:t xml:space="preserve">form</w:t>
-      </w:r>
-      <w:r>
-        <w:t xml:space="preserve"> </w:t>
-      </w:r>
-      <w:r>
-        <w:t xml:space="preserve">of</w:t>
-      </w:r>
-      <w:r>
-        <w:t xml:space="preserve"> </w:t>
-      </w:r>
-      <w:r>
-        <w:t xml:space="preserve">the</w:t>
-      </w:r>
-      <w:r>
-        <w:t xml:space="preserve"> </w:t>
-      </w:r>
-      <w:r>
-        <w:t xml:space="preserve">full</w:t>
-      </w:r>
-      <w:r>
-        <w:t xml:space="preserve"> </w:t>
-      </w:r>
-      <w:r>
-        <w:t xml:space="preserve">algorithm</w:t>
-      </w:r>
-      <w:r>
-        <w:t xml:space="preserve"> </w:t>
-      </w:r>
-      <w:r>
-        <w:t xml:space="preserve">that</w:t>
-      </w:r>
-      <w:r>
-        <w:t xml:space="preserve"> </w:t>
-      </w:r>
-      <w:r>
-        <w:t xml:space="preserve">preserves</w:t>
-      </w:r>
-      <w:r>
-        <w:t xml:space="preserve"> </w:t>
-      </w:r>
-      <w:r>
-        <w:t xml:space="preserve">order</w:t>
-      </w:r>
-      <w:r>
-        <w:t xml:space="preserve"> </w:t>
-      </w:r>
-      <w:r>
-        <w:t xml:space="preserve">inside</w:t>
-      </w:r>
-      <w:r>
-        <w:t xml:space="preserve"> </w:t>
-      </w:r>
-      <w:r>
-        <w:t xml:space="preserve">the</w:t>
-      </w:r>
-      <w:r>
-        <w:t xml:space="preserve"> </w:t>
-      </w:r>
-      <w:r>
-        <w:t xml:space="preserve">marked</w:t>
-      </w:r>
-      <w:r>
-        <w:t xml:space="preserve"> </w:t>
-      </w:r>
-      <w:r>
-        <w:t xml:space="preserve">and</w:t>
-      </w:r>
-      <w:r>
-        <w:t xml:space="preserve"> </w:t>
-      </w:r>
-      <w:r>
-        <w:t xml:space="preserve">unmarked</w:t>
-      </w:r>
-      <w:r>
-        <w:t xml:space="preserve"> </w:t>
-      </w:r>
-      <w:r>
-        <w:t xml:space="preserve">sets.</w:t>
-      </w:r>
-      <w:r>
-        <w:t xml:space="preserve"> </w:t>
-      </w:r>
-      <w:r>
-        <w:t xml:space="preserve">On</w:t>
-      </w:r>
-      <w:r>
-        <w:t xml:space="preserve"> </w:t>
-      </w:r>
-      <w:r>
-        <w:t xml:space="preserve">the</w:t>
-      </w:r>
-      <w:r>
-        <w:t xml:space="preserve"> </w:t>
-      </w:r>
-      <w:r>
-        <w:t xml:space="preserve">SciFact</w:t>
-      </w:r>
-      <w:r>
-        <w:t xml:space="preserve"> </w:t>
-      </w:r>
-      <w:r>
-        <w:t xml:space="preserve">benchmark</w:t>
-      </w:r>
-      <w:r>
-        <w:t xml:space="preserve"> </w:t>
-      </w:r>
-      <w:r>
-        <w:t xml:space="preserve">with</w:t>
-      </w:r>
-      <w:r>
-        <w:t xml:space="preserve"> </w:t>
-      </w:r>
-      <w:r>
-        <w:t xml:space="preserve">the</w:t>
-      </w:r>
-      <w:r>
-        <w:t xml:space="preserve"> </w:t>
-      </w:r>
-      <w:r>
-        <w:t xml:space="preserve">all-MiniLM-L6-v2</w:t>
-      </w:r>
-      <w:r>
-        <w:t xml:space="preserve"> </w:t>
-      </w:r>
-      <w:r>
-        <w:t xml:space="preserve">encoder,</w:t>
-      </w:r>
-      <w:r>
-        <w:t xml:space="preserve"> </w:t>
-      </w:r>
-      <w:r>
-        <w:t xml:space="preserve">hybrid</w:t>
-      </w:r>
-      <w:r>
-        <w:t xml:space="preserve"> </w:t>
-      </w:r>
-      <w:r>
-        <w:t xml:space="preserve">fusion</w:t>
-      </w:r>
-      <w:r>
-        <w:t xml:space="preserve"> </w:t>
-      </w:r>
-      <w:r>
-        <w:t xml:space="preserve">reaches</w:t>
-      </w:r>
-      <w:r>
-        <w:t xml:space="preserve"> </w:t>
-      </w:r>
-      <w:r>
-        <w:t xml:space="preserve">nDCG@10</w:t>
-      </w:r>
-      <w:r>
-        <w:t xml:space="preserve"> </w:t>
-      </w:r>
-      <w:r>
-        <w:t xml:space="preserve">of</w:t>
-      </w:r>
-      <w:r>
-        <w:t xml:space="preserve"> </w:t>
-      </w:r>
-      <w:r>
-        <w:t xml:space="preserve">0.707</w:t>
-      </w:r>
-      <w:r>
-        <w:t xml:space="preserve"> </w:t>
-      </w:r>
-      <w:r>
-        <w:t xml:space="preserve">against</w:t>
-      </w:r>
-      <w:r>
-        <w:t xml:space="preserve"> </w:t>
-      </w:r>
-      <w:r>
-        <w:t xml:space="preserve">0.645</w:t>
-      </w:r>
-      <w:r>
-        <w:t xml:space="preserve"> </w:t>
-      </w:r>
-      <w:r>
-        <w:t xml:space="preserve">for</w:t>
-      </w:r>
-      <w:r>
-        <w:t xml:space="preserve"> </w:t>
-      </w:r>
-      <w:r>
-        <w:t xml:space="preserve">dense</w:t>
-      </w:r>
-      <w:r>
-        <w:t xml:space="preserve"> </w:t>
-      </w:r>
-      <w:r>
-        <w:t xml:space="preserve">search,</w:t>
-      </w:r>
-      <w:r>
-        <w:t xml:space="preserve"> </w:t>
-      </w:r>
-      <w:r>
-        <w:t xml:space="preserve">0.665</w:t>
-      </w:r>
-      <w:r>
-        <w:t xml:space="preserve"> </w:t>
-      </w:r>
-      <w:r>
-        <w:t xml:space="preserve">for</w:t>
-      </w:r>
-      <w:r>
-        <w:t xml:space="preserve"> </w:t>
-      </w:r>
-      <w:r>
-        <w:t xml:space="preserve">BM25</w:t>
-      </w:r>
-      <w:r>
-        <w:t xml:space="preserve"> </w:t>
-      </w:r>
-      <w:r>
-        <w:t xml:space="preserve">and</w:t>
-      </w:r>
-      <w:r>
-        <w:t xml:space="preserve"> </w:t>
-      </w:r>
-      <w:r>
-        <w:t xml:space="preserve">0.681</w:t>
-      </w:r>
-      <w:r>
-        <w:t xml:space="preserve"> </w:t>
-      </w:r>
-      <w:r>
-        <w:t xml:space="preserve">for</w:t>
-      </w:r>
-      <w:r>
-        <w:t xml:space="preserve"> </w:t>
-      </w:r>
-      <w:r>
-        <w:t xml:space="preserve">reciprocal</w:t>
-      </w:r>
-      <w:r>
-        <w:t xml:space="preserve"> </w:t>
-      </w:r>
-      <w:r>
-        <w:t xml:space="preserve">rank</w:t>
-      </w:r>
-      <w:r>
-        <w:t xml:space="preserve"> </w:t>
-      </w:r>
-      <w:r>
-        <w:t xml:space="preserve">fusion,</w:t>
-      </w:r>
-      <w:r>
-        <w:t xml:space="preserve"> </w:t>
-      </w:r>
-      <w:r>
-        <w:t xml:space="preserve">with</w:t>
-      </w:r>
-      <w:r>
-        <w:t xml:space="preserve"> </w:t>
-      </w:r>
-      <w:r>
-        <w:t xml:space="preserve">all</w:t>
-      </w:r>
-      <w:r>
-        <w:t xml:space="preserve"> </w:t>
-      </w:r>
-      <w:r>
-        <w:t xml:space="preserve">differences</w:t>
-      </w:r>
-      <w:r>
-        <w:t xml:space="preserve"> </w:t>
-      </w:r>
-      <w:r>
-        <w:t xml:space="preserve">significant</w:t>
-      </w:r>
-      <w:r>
-        <w:t xml:space="preserve"> </w:t>
-      </w:r>
-      <w:r>
-        <w:t xml:space="preserve">(p</w:t>
-      </w:r>
-      <w:r>
-        <w:t xml:space="preserve"> </w:t>
-      </w:r>
-      <w:r>
-        <w:t xml:space="preserve">&lt;</w:t>
-      </w:r>
-      <w:r>
-        <w:t xml:space="preserve"> </w:t>
-      </w:r>
-      <w:r>
-        <w:t xml:space="preserve">0.001).</w:t>
-      </w:r>
-      <w:r>
-        <w:t xml:space="preserve"> </w:t>
-      </w:r>
-      <w:r>
-        <w:t xml:space="preserve">Against</w:t>
-      </w:r>
-      <w:r>
-        <w:t xml:space="preserve"> </w:t>
-      </w:r>
-      <w:r>
-        <w:t xml:space="preserve">the</w:t>
-      </w:r>
-      <w:r>
-        <w:t xml:space="preserve"> </w:t>
-      </w:r>
-      <w:r>
-        <w:t xml:space="preserve">1.x</w:t>
-      </w:r>
-      <w:r>
-        <w:t xml:space="preserve"> </w:t>
-      </w:r>
-      <w:r>
-        <w:t xml:space="preserve">code,</w:t>
-      </w:r>
-      <w:r>
-        <w:t xml:space="preserve"> </w:t>
-      </w:r>
-      <w:r>
-        <w:t xml:space="preserve">in-index</w:t>
-      </w:r>
-      <w:r>
-        <w:t xml:space="preserve"> </w:t>
-      </w:r>
-      <w:r>
-        <w:t xml:space="preserve">constraints</w:t>
-      </w:r>
-      <w:r>
-        <w:t xml:space="preserve"> </w:t>
-      </w:r>
-      <w:r>
-        <w:t xml:space="preserve">raise</w:t>
-      </w:r>
-      <w:r>
-        <w:t xml:space="preserve"> </w:t>
-      </w:r>
-      <w:r>
-        <w:t xml:space="preserve">recall</w:t>
-      </w:r>
-      <w:r>
-        <w:t xml:space="preserve"> </w:t>
-      </w:r>
-      <w:r>
-        <w:t xml:space="preserve">within</w:t>
-      </w:r>
-      <w:r>
-        <w:t xml:space="preserve"> </w:t>
-      </w:r>
-      <w:r>
-        <w:t xml:space="preserve">small</w:t>
-      </w:r>
-      <w:r>
-        <w:t xml:space="preserve"> </w:t>
-      </w:r>
-      <w:r>
-        <w:t xml:space="preserve">namespaces</w:t>
-      </w:r>
-      <w:r>
-        <w:t xml:space="preserve"> </w:t>
-      </w:r>
-      <w:r>
-        <w:t xml:space="preserve">from</w:t>
-      </w:r>
-      <w:r>
-        <w:t xml:space="preserve"> </w:t>
-      </w:r>
-      <w:r>
-        <w:t xml:space="preserve">0.5%</w:t>
-      </w:r>
-      <w:r>
-        <w:t xml:space="preserve"> </w:t>
-      </w:r>
-      <w:r>
-        <w:t xml:space="preserve">to</w:t>
-      </w:r>
-      <w:r>
-        <w:t xml:space="preserve"> </w:t>
-      </w:r>
-      <w:r>
-        <w:t xml:space="preserve">100%,</w:t>
-      </w:r>
-      <w:r>
-        <w:t xml:space="preserve"> </w:t>
-      </w:r>
-      <w:r>
-        <w:t xml:space="preserve">incremental</w:t>
-      </w:r>
-      <w:r>
-        <w:t xml:space="preserve"> </w:t>
-      </w:r>
-      <w:r>
-        <w:t xml:space="preserve">indexing</w:t>
-      </w:r>
-      <w:r>
-        <w:t xml:space="preserve"> </w:t>
-      </w:r>
-      <w:r>
-        <w:t xml:space="preserve">makes</w:t>
-      </w:r>
-      <w:r>
-        <w:t xml:space="preserve"> </w:t>
-      </w:r>
-      <w:r>
-        <w:t xml:space="preserve">insertion</w:t>
-      </w:r>
-      <w:r>
-        <w:t xml:space="preserve"> </w:t>
-      </w:r>
-      <w:r>
-        <w:t xml:space="preserve">183</w:t>
-      </w:r>
-      <w:r>
-        <w:t xml:space="preserve"> </w:t>
-      </w:r>
-      <w:r>
-        <w:t xml:space="preserve">times</w:t>
-      </w:r>
-      <w:r>
-        <w:t xml:space="preserve"> </w:t>
-      </w:r>
-      <w:r>
-        <w:t xml:space="preserve">faster,</w:t>
-      </w:r>
-      <w:r>
-        <w:t xml:space="preserve"> </w:t>
-      </w:r>
-      <w:r>
-        <w:t xml:space="preserve">and</w:t>
-      </w:r>
-      <w:r>
-        <w:t xml:space="preserve"> </w:t>
-      </w:r>
-      <w:r>
-        <w:t xml:space="preserve">snapshots</w:t>
-      </w:r>
-      <w:r>
-        <w:t xml:space="preserve"> </w:t>
-      </w:r>
-      <w:r>
-        <w:t xml:space="preserve">make</w:t>
-      </w:r>
-      <w:r>
-        <w:t xml:space="preserve"> </w:t>
-      </w:r>
-      <w:r>
-        <w:t xml:space="preserve">reopening</w:t>
-      </w:r>
-      <w:r>
-        <w:t xml:space="preserve"> </w:t>
-      </w:r>
-      <w:r>
-        <w:t xml:space="preserve">9</w:t>
-      </w:r>
-      <w:r>
-        <w:t xml:space="preserve"> </w:t>
-      </w:r>
-      <w:r>
-        <w:t xml:space="preserve">to</w:t>
-      </w:r>
-      <w:r>
-        <w:t xml:space="preserve"> </w:t>
-      </w:r>
-      <w:r>
-        <w:t xml:space="preserve">17</w:t>
-      </w:r>
-      <w:r>
-        <w:t xml:space="preserve"> </w:t>
-      </w:r>
-      <w:r>
-        <w:t xml:space="preserve">times</w:t>
-      </w:r>
-      <w:r>
-        <w:t xml:space="preserve"> </w:t>
-      </w:r>
-      <w:r>
-        <w:t xml:space="preserve">faster.</w:t>
-      </w:r>
-      <w:r>
-        <w:t xml:space="preserve"> </w:t>
-      </w:r>
-      <w:r>
-        <w:t xml:space="preserve">Encryption,</w:t>
-      </w:r>
-      <w:r>
-        <w:t xml:space="preserve"> </w:t>
-      </w:r>
-      <w:r>
-        <w:t xml:space="preserve">audit</w:t>
-      </w:r>
-      <w:r>
-        <w:t xml:space="preserve"> </w:t>
-      </w:r>
-      <w:r>
-        <w:t xml:space="preserve">logging</w:t>
-      </w:r>
-      <w:r>
-        <w:t xml:space="preserve"> </w:t>
-      </w:r>
-      <w:r>
-        <w:t xml:space="preserve">and</w:t>
-      </w:r>
-      <w:r>
-        <w:t xml:space="preserve"> </w:t>
-      </w:r>
-      <w:r>
-        <w:t xml:space="preserve">access</w:t>
-      </w:r>
-      <w:r>
-        <w:t xml:space="preserve"> </w:t>
-      </w:r>
-      <w:r>
-        <w:t xml:space="preserve">control</w:t>
-      </w:r>
-      <w:r>
-        <w:t xml:space="preserve"> </w:t>
-      </w:r>
-      <w:r>
-        <w:t xml:space="preserve">add</w:t>
-      </w:r>
-      <w:r>
-        <w:t xml:space="preserve"> </w:t>
-      </w:r>
-      <w:r>
-        <w:t xml:space="preserve">little</w:t>
-      </w:r>
-      <w:r>
-        <w:t xml:space="preserve"> </w:t>
-      </w:r>
-      <w:r>
-        <w:t xml:space="preserve">measurable</w:t>
-      </w:r>
-      <w:r>
-        <w:t xml:space="preserve"> </w:t>
-      </w:r>
-      <w:r>
-        <w:t xml:space="preserve">cost.</w:t>
-      </w:r>
-      <w:r>
-        <w:t xml:space="preserve"> </w:t>
-      </w:r>
-      <w:r>
-        <w:t xml:space="preserve">We</w:t>
-      </w:r>
-      <w:r>
-        <w:t xml:space="preserve"> </w:t>
-      </w:r>
-      <w:r>
-        <w:t xml:space="preserve">also</w:t>
-      </w:r>
-      <w:r>
-        <w:t xml:space="preserve"> </w:t>
-      </w:r>
-      <w:r>
-        <w:t xml:space="preserve">report</w:t>
-      </w:r>
-      <w:r>
-        <w:t xml:space="preserve"> </w:t>
-      </w:r>
-      <w:r>
-        <w:t xml:space="preserve">negative</w:t>
-      </w:r>
-      <w:r>
-        <w:t xml:space="preserve"> </w:t>
-      </w:r>
-      <w:r>
-        <w:t xml:space="preserve">results:</w:t>
-      </w:r>
-      <w:r>
-        <w:t xml:space="preserve"> </w:t>
-      </w:r>
-      <w:r>
-        <w:t xml:space="preserve">the</w:t>
-      </w:r>
-      <w:r>
-        <w:t xml:space="preserve"> </w:t>
-      </w:r>
-      <w:r>
-        <w:t xml:space="preserve">Grover</w:t>
-      </w:r>
-      <w:r>
-        <w:t xml:space="preserve"> </w:t>
-      </w:r>
-      <w:r>
-        <w:t xml:space="preserve">consensus</w:t>
-      </w:r>
-      <w:r>
-        <w:t xml:space="preserve"> </w:t>
-      </w:r>
-      <w:r>
-        <w:t xml:space="preserve">oracle</w:t>
-      </w:r>
-      <w:r>
-        <w:t xml:space="preserve"> </w:t>
-      </w:r>
-      <w:r>
-        <w:t xml:space="preserve">does</w:t>
-      </w:r>
-      <w:r>
-        <w:t xml:space="preserve"> </w:t>
-      </w:r>
-      <w:r>
-        <w:t xml:space="preserve">not</w:t>
-      </w:r>
-      <w:r>
-        <w:t xml:space="preserve"> </w:t>
-      </w:r>
-      <w:r>
-        <w:t xml:space="preserve">change</w:t>
-      </w:r>
-      <w:r>
-        <w:t xml:space="preserve"> </w:t>
-      </w:r>
-      <w:r>
-        <w:t xml:space="preserve">nDCG</w:t>
-      </w:r>
-      <w:r>
-        <w:t xml:space="preserve"> </w:t>
-      </w:r>
-      <w:r>
-        <w:t xml:space="preserve">on</w:t>
-      </w:r>
-      <w:r>
-        <w:t xml:space="preserve"> </w:t>
-      </w:r>
-      <w:r>
-        <w:t xml:space="preserve">SciFact,</w:t>
-      </w:r>
-      <w:r>
-        <w:t xml:space="preserve"> </w:t>
-      </w:r>
-      <w:r>
-        <w:t xml:space="preserve">filters</w:t>
-      </w:r>
-      <w:r>
-        <w:t xml:space="preserve"> </w:t>
-      </w:r>
-      <w:r>
-        <w:t xml:space="preserve">that</w:t>
-      </w:r>
-      <w:r>
-        <w:t xml:space="preserve"> </w:t>
-      </w:r>
-      <w:r>
-        <w:t xml:space="preserve">pass</w:t>
-      </w:r>
-      <w:r>
-        <w:t xml:space="preserve"> </w:t>
-      </w:r>
-      <w:r>
-        <w:t xml:space="preserve">0.1%</w:t>
-      </w:r>
-      <w:r>
-        <w:t xml:space="preserve"> </w:t>
-      </w:r>
-      <w:r>
-        <w:t xml:space="preserve">of</w:t>
-      </w:r>
-      <w:r>
-        <w:t xml:space="preserve"> </w:t>
-      </w:r>
-      <w:r>
-        <w:t xml:space="preserve">documents</w:t>
-      </w:r>
-      <w:r>
-        <w:t xml:space="preserve"> </w:t>
-      </w:r>
-      <w:r>
-        <w:t xml:space="preserve">are</w:t>
-      </w:r>
-      <w:r>
-        <w:t xml:space="preserve"> </w:t>
-      </w:r>
-      <w:r>
-        <w:t xml:space="preserve">slow,</w:t>
-      </w:r>
-      <w:r>
-        <w:t xml:space="preserve"> </w:t>
-      </w:r>
-      <w:r>
-        <w:t xml:space="preserve">cosine-based</w:t>
-      </w:r>
-      <w:r>
-        <w:t xml:space="preserve"> </w:t>
-      </w:r>
-      <w:r>
-        <w:t xml:space="preserve">memory</w:t>
-      </w:r>
-      <w:r>
-        <w:t xml:space="preserve"> </w:t>
-      </w:r>
-      <w:r>
-        <w:t xml:space="preserve">deduplication</w:t>
-      </w:r>
-      <w:r>
-        <w:t xml:space="preserve"> </w:t>
-      </w:r>
-      <w:r>
-        <w:t xml:space="preserve">cannot</w:t>
-      </w:r>
-      <w:r>
-        <w:t xml:space="preserve"> </w:t>
-      </w:r>
-      <w:r>
-        <w:t xml:space="preserve">separate</w:t>
-      </w:r>
-      <w:r>
-        <w:t xml:space="preserve"> </w:t>
-      </w:r>
-      <w:r>
-        <w:t xml:space="preserve">paraphrases</w:t>
-      </w:r>
-      <w:r>
-        <w:t xml:space="preserve"> </w:t>
-      </w:r>
-      <w:r>
-        <w:t xml:space="preserve">from</w:t>
-      </w:r>
-      <w:r>
-        <w:t xml:space="preserve"> </w:t>
-      </w:r>
-      <w:r>
-        <w:t xml:space="preserve">statements</w:t>
-      </w:r>
-      <w:r>
-        <w:t xml:space="preserve"> </w:t>
-      </w:r>
-      <w:r>
-        <w:t xml:space="preserve">that</w:t>
-      </w:r>
-      <w:r>
-        <w:t xml:space="preserve"> </w:t>
-      </w:r>
-      <w:r>
-        <w:t xml:space="preserve">differ</w:t>
-      </w:r>
-      <w:r>
-        <w:t xml:space="preserve"> </w:t>
-      </w:r>
-      <w:r>
-        <w:t xml:space="preserve">in</w:t>
-      </w:r>
-      <w:r>
-        <w:t xml:space="preserve"> </w:t>
-      </w:r>
-      <w:r>
-        <w:t xml:space="preserve">a</w:t>
-      </w:r>
-      <w:r>
-        <w:t xml:space="preserve"> </w:t>
-      </w:r>
-      <w:r>
-        <w:t xml:space="preserve">single</w:t>
-      </w:r>
-      <w:r>
-        <w:t xml:space="preserve"> </w:t>
-      </w:r>
-      <w:r>
-        <w:t xml:space="preserve">value,</w:t>
-      </w:r>
-      <w:r>
-        <w:t xml:space="preserve"> </w:t>
-      </w:r>
-      <w:r>
-        <w:t xml:space="preserve">and</w:t>
-      </w:r>
-      <w:r>
-        <w:t xml:space="preserve"> </w:t>
-      </w:r>
-      <w:r>
-        <w:t xml:space="preserve">query</w:t>
-      </w:r>
-      <w:r>
-        <w:t xml:space="preserve"> </w:t>
-      </w:r>
-      <w:r>
-        <w:t xml:space="preserve">throughput</w:t>
-      </w:r>
-      <w:r>
-        <w:t xml:space="preserve"> </w:t>
-      </w:r>
-      <w:r>
-        <w:t xml:space="preserve">stops</w:t>
-      </w:r>
-      <w:r>
-        <w:t xml:space="preserve"> </w:t>
-      </w:r>
-      <w:r>
-        <w:t xml:space="preserve">growing</w:t>
-      </w:r>
-      <w:r>
-        <w:t xml:space="preserve"> </w:t>
-      </w:r>
-      <w:r>
-        <w:t xml:space="preserve">beyond</w:t>
-      </w:r>
-      <w:r>
-        <w:t xml:space="preserve"> </w:t>
-      </w:r>
-      <w:r>
-        <w:t xml:space="preserve">two</w:t>
-      </w:r>
-      <w:r>
-        <w:t xml:space="preserve"> </w:t>
-      </w:r>
-      <w:r>
-        <w:t xml:space="preserve">threads.</w:t>
-      </w:r>
-      <w:r>
-        <w:t xml:space="preserve"> </w:t>
-      </w:r>
-      <w:r>
-        <w:t xml:space="preserve">The</w:t>
-      </w:r>
-      <w:r>
-        <w:t xml:space="preserve"> </w:t>
-      </w:r>
-      <w:r>
-        <w:t xml:space="preserve">system,</w:t>
-      </w:r>
-      <w:r>
-        <w:t xml:space="preserve"> </w:t>
-      </w:r>
-      <w:r>
-        <w:t xml:space="preserve">experiments</w:t>
-      </w:r>
-      <w:r>
-        <w:t xml:space="preserve"> </w:t>
-      </w:r>
-      <w:r>
-        <w:t xml:space="preserve">and</w:t>
-      </w:r>
-      <w:r>
-        <w:t xml:space="preserve"> </w:t>
-      </w:r>
-      <w:r>
-        <w:t xml:space="preserve">data</w:t>
-      </w:r>
-      <w:r>
-        <w:t xml:space="preserve"> </w:t>
-      </w:r>
-      <w:r>
-        <w:t xml:space="preserve">generators</w:t>
-      </w:r>
-      <w:r>
-        <w:t xml:space="preserve"> </w:t>
-      </w:r>
-      <w:r>
-        <w:t xml:space="preserve">are</w:t>
-      </w:r>
-      <w:r>
-        <w:t xml:space="preserve"> </w:t>
-      </w:r>
-      <w:r>
-        <w:t xml:space="preserve">released</w:t>
-      </w:r>
-      <w:r>
-        <w:t xml:space="preserve"> </w:t>
-      </w:r>
-      <w:r>
-        <w:t xml:space="preserve">for</w:t>
-      </w:r>
-      <w:r>
-        <w:t xml:space="preserve"> </w:t>
-      </w:r>
-      <w:r>
-        <w:t xml:space="preserve">reproduction.</w:t>
+        <w:t xml:space="preserve">released.</w:t>
       </w:r>
     </w:p>
     <w:bookmarkStart w:id="20" w:name="introduction"/>
@@ -3981,7 +3903,7 @@
       <w:r>
         <w:drawing>
           <wp:inline>
-            <wp:extent cx="4655820" cy="2685468"/>
+            <wp:extent cx="4655820" cy="2678986"/>
             <wp:effectExtent b="0" l="0" r="0" t="0"/>
             <wp:docPr descr="Figure 3. Vault schema (entity-relationship diagram). All tables live in one SQLite file and are encrypted together when a key is given." title="" id="32" name="Picture"/>
             <a:graphic>
@@ -4002,7 +3924,7 @@
                   <pic:spPr bwMode="auto">
                     <a:xfrm>
                       <a:off x="0" y="0"/>
-                      <a:ext cx="4655820" cy="2685468"/>
+                      <a:ext cx="4655820" cy="2678986"/>
                     </a:xfrm>
                     <a:prstGeom prst="rect">
                       <a:avLst/>
@@ -4118,7 +4040,7 @@
       <w:r>
         <w:drawing>
           <wp:inline>
-            <wp:extent cx="4417060" cy="3166211"/>
+            <wp:extent cx="4417060" cy="3218805"/>
             <wp:effectExtent b="0" l="0" r="0" t="0"/>
             <wp:docPr descr="Figure 4. Batch insert (sequence diagram). The database commit happens before the index update, and a failed index update is rolled back by deleting the new rows." title="" id="36" name="Picture"/>
             <a:graphic>
@@ -4139,7 +4061,7 @@
                   <pic:spPr bwMode="auto">
                     <a:xfrm>
                       <a:off x="0" y="0"/>
-                      <a:ext cx="4417060" cy="3166211"/>
+                      <a:ext cx="4417060" cy="3218805"/>
                     </a:xfrm>
                     <a:prstGeom prst="rect">
                       <a:avLst/>
@@ -4261,7 +4183,7 @@
       <w:r>
         <w:drawing>
           <wp:inline>
-            <wp:extent cx="4178300" cy="1146910"/>
+            <wp:extent cx="4178300" cy="1141251"/>
             <wp:effectExtent b="0" l="0" r="0" t="0"/>
             <wp:docPr descr="Figure 5. Opening a vault (flowchart). The generation check makes a stale snapshot impossible to load." title="" id="40" name="Picture"/>
             <a:graphic>
@@ -4282,7 +4204,7 @@
                   <pic:spPr bwMode="auto">
                     <a:xfrm>
                       <a:off x="0" y="0"/>
-                      <a:ext cx="4178300" cy="1146910"/>
+                      <a:ext cx="4178300" cy="1141251"/>
                     </a:xfrm>
                     <a:prstGeom prst="rect">
                       <a:avLst/>
@@ -9695,7 +9617,7 @@
       <w:r>
         <w:drawing>
           <wp:inline>
-            <wp:extent cx="5133340" cy="1341201"/>
+            <wp:extent cx="5133340" cy="1336874"/>
             <wp:effectExtent b="0" l="0" r="0" t="0"/>
             <wp:docPr descr="Figure 8. Life cycle of a memory (state diagram). A new statement is either stored or merged into an existing memory, which then gains importance." title="" id="66" name="Picture"/>
             <a:graphic>
@@ -9716,7 +9638,7 @@
                   <pic:spPr bwMode="auto">
                     <a:xfrm>
                       <a:off x="0" y="0"/>
-                      <a:ext cx="5133340" cy="1341201"/>
+                      <a:ext cx="5133340" cy="1336874"/>
                     </a:xfrm>
                     <a:prstGeom prst="rect">
                       <a:avLst/>
@@ -10453,7 +10375,7 @@
       <w:r>
         <w:drawing>
           <wp:inline>
-            <wp:extent cx="4417060" cy="3639835"/>
+            <wp:extent cx="4417060" cy="3684899"/>
             <wp:effectExtent b="0" l="0" r="0" t="0"/>
             <wp:docPr descr="Figure 9. Memory across two conversations (sequence diagram). A preference stored in the first conversation is returned in the briefing that opens the second." title="" id="73" name="Picture"/>
             <a:graphic>
@@ -10474,7 +10396,7 @@
                   <pic:spPr bwMode="auto">
                     <a:xfrm>
                       <a:off x="0" y="0"/>
-                      <a:ext cx="4417060" cy="3639835"/>
+                      <a:ext cx="4417060" cy="3684899"/>
                     </a:xfrm>
                     <a:prstGeom prst="rect">
                       <a:avLst/>
@@ -11305,7 +11227,7 @@
       <w:r>
         <w:drawing>
           <wp:inline>
-            <wp:extent cx="5491480" cy="3752048"/>
+            <wp:extent cx="5491480" cy="3745646"/>
             <wp:effectExtent b="0" l="0" r="0" t="0"/>
             <wp:docPr descr="Figure 10. Evaluation method (methodology diagram)." title="" id="80" name="Picture"/>
             <a:graphic>
@@ -11326,7 +11248,7 @@
                   <pic:spPr bwMode="auto">
                     <a:xfrm>
                       <a:off x="0" y="0"/>
-                      <a:ext cx="5491480" cy="3752048"/>
+                      <a:ext cx="5491480" cy="3745646"/>
                     </a:xfrm>
                     <a:prstGeom prst="rect">
                       <a:avLst/>
@@ -16488,7 +16410,7 @@
         <w:t xml:space="preserve">	</w:t>
       </w:r>
       <w:r>
-        <w:t xml:space="preserve">Anthropic,</w:t>
+        <w:t xml:space="preserve">Model Context Protocol Project,</w:t>
       </w:r>
       <w:r>
         <w:t xml:space="preserve"> </w:t>

</xml_diff>

<commit_message>
Paper: review fixes to figures, Word and arXiv builds
Figures: dot and whisker chart for the SciFact results instead of bars on
a truncated axis; hatched segment and grids drawn under the bars in the
stage chart; opaque histogram bars with an outlined second series;
readable labels in the Grover geometry; markers instead of bars on the
log-scale reopen chart; composites padded rather than rescaled; retriever
and memory roles coloured consistently in every diagram; loop edges in
orange; a halo behind sequence-diagram text that crosses a lifeline;
plain words instead of symbols in labels.

Text: the thread experiment now cites Figure 21b; parentheses around
inline maths no longer break across lines; wider numeric columns for
Word; subject metadata.

Builds: embedded font for the PDF page numbers; Word gets page numbers,
a Keywords line, rows that do not split across pages and a linked ORCID;
the arXiv build prints the ORCID iD and aligns all captions the same way.
</commit_message>
<xml_diff>
--- a/paper/VecForge-2.0-Paper.docx
+++ b/paper/VecForge-2.0-Paper.docx
@@ -113,7 +113,18 @@
         <w:pStyle w:val="Date"/>
       </w:pPr>
       <w:r>
-        <w:t xml:space="preserve">ArcGX TechLabs Private Limited, Tiruchirappalli, Tamil Nadu, India. suneelbose@arcgx.in. ORCID iD https://orcid.org/0009-0000-9282-2287. October 2026</w:t>
+        <w:t xml:space="preserve">ArcGX TechLabs Private Limited, Tiruchirappalli, Tamil Nadu, India. suneelbose@arcgx.in. ORCID iD </w:t>
+      </w:r>
+      <w:hyperlink r:id="rId10">
+        <w:r>
+          <w:rPr>
+            <w:rStyle w:val="Hyperlink"/>
+          </w:rPr>
+          <w:t>https://orcid.org/0009-0000-9282-2287</w:t>
+        </w:r>
+      </w:hyperlink>
+      <w:r>
+        <w:t>. October 2026</w:t>
       </w:r>
     </w:p>
     <w:p>
@@ -1834,6 +1845,24 @@
       </w:r>
       <w:r>
         <w:t xml:space="preserve">released.</w:t>
+      </w:r>
+    </w:p>
+    <w:p>
+      <w:pPr>
+        <w:pStyle w:val="FirstParagraph"/>
+      </w:pPr>
+      <w:r>
+        <w:rPr>
+          <w:bCs/>
+          <w:b/>
+        </w:rPr>
+        <w:t xml:space="preserve">Keywords:</w:t>
+      </w:r>
+      <w:r>
+        <w:t xml:space="preserve"> </w:t>
+      </w:r>
+      <w:r>
+        <w:t xml:space="preserve">vector database, hybrid retrieval, BM25, FAISS, agent memory, Model Context Protocol, Grover search, amplitude amplification, local-first software, encryption</w:t>
       </w:r>
     </w:p>
     <w:bookmarkStart w:id="20" w:name="introduction"/>
@@ -2570,16 +2599,17 @@
         <w:tblCaption w:val="Table 1. Capabilities by class of system. “Library” means the capability is provided by the system itself rather than left to the application."/>
       </w:tblPr>
       <w:tblGrid>
-        <w:gridCol w:w="2664"/>
-        <w:gridCol w:w="962"/>
-        <w:gridCol w:w="1110"/>
-        <w:gridCol w:w="1110"/>
-        <w:gridCol w:w="1110"/>
-        <w:gridCol w:w="962"/>
+        <w:gridCol w:w="2132"/>
+        <w:gridCol w:w="1066"/>
+        <w:gridCol w:w="1218"/>
+        <w:gridCol w:w="1218"/>
+        <w:gridCol w:w="1218"/>
+        <w:gridCol w:w="1066"/>
       </w:tblGrid>
       <w:tr>
         <w:trPr>
           <w:tblHeader w:val="true"/>
+          <w:cantSplit/>
         </w:trPr>
         <w:tc>
           <w:tcPr/>
@@ -2655,6 +2685,9 @@
         </w:tc>
       </w:tr>
       <w:tr>
+        <w:trPr>
+          <w:cantSplit/>
+        </w:trPr>
         <w:tc>
           <w:tcPr/>
           <w:p>
@@ -2729,6 +2762,9 @@
         </w:tc>
       </w:tr>
       <w:tr>
+        <w:trPr>
+          <w:cantSplit/>
+        </w:trPr>
         <w:tc>
           <w:tcPr/>
           <w:p>
@@ -2803,6 +2839,9 @@
         </w:tc>
       </w:tr>
       <w:tr>
+        <w:trPr>
+          <w:cantSplit/>
+        </w:trPr>
         <w:tc>
           <w:tcPr/>
           <w:p>
@@ -2877,6 +2916,9 @@
         </w:tc>
       </w:tr>
       <w:tr>
+        <w:trPr>
+          <w:cantSplit/>
+        </w:trPr>
         <w:tc>
           <w:tcPr/>
           <w:p>
@@ -2951,6 +2993,9 @@
         </w:tc>
       </w:tr>
       <w:tr>
+        <w:trPr>
+          <w:cantSplit/>
+        </w:trPr>
         <w:tc>
           <w:tcPr/>
           <w:p>
@@ -3025,6 +3070,9 @@
         </w:tc>
       </w:tr>
       <w:tr>
+        <w:trPr>
+          <w:cantSplit/>
+        </w:trPr>
         <w:tc>
           <w:tcPr/>
           <w:p>
@@ -3099,6 +3147,9 @@
         </w:tc>
       </w:tr>
       <w:tr>
+        <w:trPr>
+          <w:cantSplit/>
+        </w:trPr>
         <w:tc>
           <w:tcPr/>
           <w:p>
@@ -3252,6 +3303,7 @@
       <w:tr>
         <w:trPr>
           <w:tblHeader w:val="true"/>
+          <w:cantSplit/>
         </w:trPr>
         <w:tc>
           <w:tcPr/>
@@ -3291,6 +3343,9 @@
         </w:tc>
       </w:tr>
       <w:tr>
+        <w:trPr>
+          <w:cantSplit/>
+        </w:trPr>
         <w:tc>
           <w:tcPr/>
           <w:p>
@@ -3329,6 +3384,9 @@
         </w:tc>
       </w:tr>
       <w:tr>
+        <w:trPr>
+          <w:cantSplit/>
+        </w:trPr>
         <w:tc>
           <w:tcPr/>
           <w:p>
@@ -3367,6 +3425,9 @@
         </w:tc>
       </w:tr>
       <w:tr>
+        <w:trPr>
+          <w:cantSplit/>
+        </w:trPr>
         <w:tc>
           <w:tcPr/>
           <w:p>
@@ -3405,6 +3466,9 @@
         </w:tc>
       </w:tr>
       <w:tr>
+        <w:trPr>
+          <w:cantSplit/>
+        </w:trPr>
         <w:tc>
           <w:tcPr/>
           <w:p>
@@ -3443,6 +3507,9 @@
         </w:tc>
       </w:tr>
       <w:tr>
+        <w:trPr>
+          <w:cantSplit/>
+        </w:trPr>
         <w:tc>
           <w:tcPr/>
           <w:p>
@@ -3481,6 +3548,9 @@
         </w:tc>
       </w:tr>
       <w:tr>
+        <w:trPr>
+          <w:cantSplit/>
+        </w:trPr>
         <w:tc>
           <w:tcPr/>
           <w:p>
@@ -3569,7 +3639,7 @@
       <w:r>
         <w:drawing>
           <wp:inline>
-            <wp:extent cx="5969000" cy="3462020"/>
+            <wp:extent cx="5969000" cy="3569462"/>
             <wp:effectExtent b="0" l="0" r="0" t="0"/>
             <wp:docPr descr="Figure 1. VecForge 2.0 architecture (block diagram). Clients reach the vault core, which writes to SQLite in one transaction and then updates the FAISS and BM25 indexes. Reads fuse both retrievers and can rerank. Index snapshots and agent memory live in the same encrypted file." title="" id="24" name="Picture"/>
             <a:graphic>
@@ -3590,7 +3660,7 @@
                   <pic:spPr bwMode="auto">
                     <a:xfrm>
                       <a:off x="0" y="0"/>
-                      <a:ext cx="5969000" cy="3462020"/>
+                      <a:ext cx="5969000" cy="3569462"/>
                     </a:xfrm>
                     <a:prstGeom prst="rect">
                       <a:avLst/>
@@ -3684,7 +3754,7 @@
       <w:r>
         <w:drawing>
           <wp:inline>
-            <wp:extent cx="5969000" cy="2082209"/>
+            <wp:extent cx="5969000" cy="2165497"/>
             <wp:effectExtent b="0" l="0" r="0" t="0"/>
             <wp:docPr descr="Figure 2. Query pipeline (flowchart). The loop through “Widen to 4m” runs only when a metadata filter rejects too many candidates." title="" id="27" name="Picture"/>
             <a:graphic>
@@ -3705,7 +3775,7 @@
                   <pic:spPr bwMode="auto">
                     <a:xfrm>
                       <a:off x="0" y="0"/>
-                      <a:ext cx="5969000" cy="2082209"/>
+                      <a:ext cx="5969000" cy="2165497"/>
                     </a:xfrm>
                     <a:prstGeom prst="rect">
                       <a:avLst/>
@@ -3903,7 +3973,7 @@
       <w:r>
         <w:drawing>
           <wp:inline>
-            <wp:extent cx="4655820" cy="2678986"/>
+            <wp:extent cx="4655820" cy="2808615"/>
             <wp:effectExtent b="0" l="0" r="0" t="0"/>
             <wp:docPr descr="Figure 3. Vault schema (entity-relationship diagram). All tables live in one SQLite file and are encrypted together when a key is given." title="" id="32" name="Picture"/>
             <a:graphic>
@@ -3924,7 +3994,7 @@
                   <pic:spPr bwMode="auto">
                     <a:xfrm>
                       <a:off x="0" y="0"/>
-                      <a:ext cx="4655820" cy="2678986"/>
+                      <a:ext cx="4655820" cy="2808615"/>
                     </a:xfrm>
                     <a:prstGeom prst="rect">
                       <a:avLst/>
@@ -4040,7 +4110,7 @@
       <w:r>
         <w:drawing>
           <wp:inline>
-            <wp:extent cx="4417060" cy="3218805"/>
+            <wp:extent cx="4417060" cy="3368695"/>
             <wp:effectExtent b="0" l="0" r="0" t="0"/>
             <wp:docPr descr="Figure 4. Batch insert (sequence diagram). The database commit happens before the index update, and a failed index update is rolled back by deleting the new rows." title="" id="36" name="Picture"/>
             <a:graphic>
@@ -4061,7 +4131,7 @@
                   <pic:spPr bwMode="auto">
                     <a:xfrm>
                       <a:off x="0" y="0"/>
-                      <a:ext cx="4417060" cy="3218805"/>
+                      <a:ext cx="4417060" cy="3368695"/>
                     </a:xfrm>
                     <a:prstGeom prst="rect">
                       <a:avLst/>
@@ -4183,7 +4253,7 @@
       <w:r>
         <w:drawing>
           <wp:inline>
-            <wp:extent cx="4178300" cy="1141251"/>
+            <wp:extent cx="4178300" cy="927659"/>
             <wp:effectExtent b="0" l="0" r="0" t="0"/>
             <wp:docPr descr="Figure 5. Opening a vault (flowchart). The generation check makes a stale snapshot impossible to load." title="" id="40" name="Picture"/>
             <a:graphic>
@@ -4204,7 +4274,7 @@
                   <pic:spPr bwMode="auto">
                     <a:xfrm>
                       <a:off x="0" y="0"/>
-                      <a:ext cx="4178300" cy="1141251"/>
+                      <a:ext cx="4178300" cy="927659"/>
                     </a:xfrm>
                     <a:prstGeom prst="rect">
                       <a:avLst/>
@@ -6142,7 +6212,7 @@
       <w:r>
         <w:drawing>
           <wp:inline>
-            <wp:extent cx="3103880" cy="2403459"/>
+            <wp:extent cx="3103880" cy="2532788"/>
             <wp:effectExtent b="0" l="0" r="0" t="0"/>
             <wp:docPr descr="Figure 6. Geometry of one Grover iteration (geometric diagram). The oracle reflects the state a across the unmarked axis, diffusion reflects it back across the uniform state s, and the net effect is a rotation by 2\theta towards the marked axis. Three iterations bring this example closest to u_M." title="" id="52" name="Picture"/>
             <a:graphic>
@@ -6163,7 +6233,7 @@
                   <pic:spPr bwMode="auto">
                     <a:xfrm>
                       <a:off x="0" y="0"/>
-                      <a:ext cx="3103880" cy="2403459"/>
+                      <a:ext cx="3103880" cy="2532788"/>
                     </a:xfrm>
                     <a:prstGeom prst="rect">
                       <a:avLst/>
@@ -9617,7 +9687,7 @@
       <w:r>
         <w:drawing>
           <wp:inline>
-            <wp:extent cx="5133340" cy="1336874"/>
+            <wp:extent cx="5133340" cy="1145272"/>
             <wp:effectExtent b="0" l="0" r="0" t="0"/>
             <wp:docPr descr="Figure 8. Life cycle of a memory (state diagram). A new statement is either stored or merged into an existing memory, which then gains importance." title="" id="66" name="Picture"/>
             <a:graphic>
@@ -9638,7 +9708,7 @@
                   <pic:spPr bwMode="auto">
                     <a:xfrm>
                       <a:off x="0" y="0"/>
-                      <a:ext cx="5133340" cy="1336874"/>
+                      <a:ext cx="5133340" cy="1145272"/>
                     </a:xfrm>
                     <a:prstGeom prst="rect">
                       <a:avLst/>
@@ -10375,7 +10445,7 @@
       <w:r>
         <w:drawing>
           <wp:inline>
-            <wp:extent cx="4417060" cy="3684899"/>
+            <wp:extent cx="4417060" cy="3689128"/>
             <wp:effectExtent b="0" l="0" r="0" t="0"/>
             <wp:docPr descr="Figure 9. Memory across two conversations (sequence diagram). A preference stored in the first conversation is returned in the briefing that opens the second." title="" id="73" name="Picture"/>
             <a:graphic>
@@ -10396,7 +10466,7 @@
                   <pic:spPr bwMode="auto">
                     <a:xfrm>
                       <a:off x="0" y="0"/>
-                      <a:ext cx="4417060" cy="3684899"/>
+                      <a:ext cx="4417060" cy="3689128"/>
                     </a:xfrm>
                     <a:prstGeom prst="rect">
                       <a:avLst/>
@@ -10850,6 +10920,7 @@
       <w:tr>
         <w:trPr>
           <w:tblHeader w:val="true"/>
+          <w:cantSplit/>
         </w:trPr>
         <w:tc>
           <w:tcPr/>
@@ -10889,6 +10960,9 @@
         </w:tc>
       </w:tr>
       <w:tr>
+        <w:trPr>
+          <w:cantSplit/>
+        </w:trPr>
         <w:tc>
           <w:tcPr/>
           <w:p>
@@ -10927,6 +11001,9 @@
         </w:tc>
       </w:tr>
       <w:tr>
+        <w:trPr>
+          <w:cantSplit/>
+        </w:trPr>
         <w:tc>
           <w:tcPr/>
           <w:p>
@@ -10965,6 +11042,9 @@
         </w:tc>
       </w:tr>
       <w:tr>
+        <w:trPr>
+          <w:cantSplit/>
+        </w:trPr>
         <w:tc>
           <w:tcPr/>
           <w:p>
@@ -11003,6 +11083,9 @@
         </w:tc>
       </w:tr>
       <w:tr>
+        <w:trPr>
+          <w:cantSplit/>
+        </w:trPr>
         <w:tc>
           <w:tcPr/>
           <w:p>
@@ -11041,6 +11124,9 @@
         </w:tc>
       </w:tr>
       <w:tr>
+        <w:trPr>
+          <w:cantSplit/>
+        </w:trPr>
         <w:tc>
           <w:tcPr/>
           <w:p>
@@ -11079,6 +11165,9 @@
         </w:tc>
       </w:tr>
       <w:tr>
+        <w:trPr>
+          <w:cantSplit/>
+        </w:trPr>
         <w:tc>
           <w:tcPr/>
           <w:p>
@@ -11117,6 +11206,9 @@
         </w:tc>
       </w:tr>
       <w:tr>
+        <w:trPr>
+          <w:cantSplit/>
+        </w:trPr>
         <w:tc>
           <w:tcPr/>
           <w:p>
@@ -11155,6 +11247,9 @@
         </w:tc>
       </w:tr>
       <w:tr>
+        <w:trPr>
+          <w:cantSplit/>
+        </w:trPr>
         <w:tc>
           <w:tcPr/>
           <w:p>
@@ -11565,9 +11660,9 @@
       <w:r>
         <w:drawing>
           <wp:inline>
-            <wp:extent cx="5969000" cy="2020057"/>
+            <wp:extent cx="5969000" cy="1974811"/>
             <wp:effectExtent b="0" l="0" r="0" t="0"/>
-            <wp:docPr descr="Figure 11. SciFact results on the 300 test claims (bar chart). Error bars are 95% bootstrap confidence intervals. The tuned weight equals the default, so it is shown once." title="" id="85" name="Picture"/>
+            <wp:docPr descr="Figure 11. SciFact results on the 300 test claims (dot and whisker chart). Whiskers are 95% bootstrap confidence intervals. The tuned weight equals the default, so it is shown once." title="" id="85" name="Picture"/>
             <a:graphic>
               <a:graphicData uri="http://schemas.openxmlformats.org/drawingml/2006/picture">
                 <pic:pic>
@@ -11586,7 +11681,7 @@
                   <pic:spPr bwMode="auto">
                     <a:xfrm>
                       <a:off x="0" y="0"/>
-                      <a:ext cx="5969000" cy="2020057"/>
+                      <a:ext cx="5969000" cy="1974811"/>
                     </a:xfrm>
                     <a:prstGeom prst="rect">
                       <a:avLst/>
@@ -11620,7 +11715,7 @@
         <w:t xml:space="preserve"> </w:t>
       </w:r>
       <w:r>
-        <w:t xml:space="preserve">SciFact results on the 300 test claims (bar chart). Error bars are 95% bootstrap confidence intervals. The tuned weight equals the default, so it is shown once.</w:t>
+        <w:t xml:space="preserve">SciFact results on the 300 test claims (dot and whisker chart). Whiskers are 95% bootstrap confidence intervals. The tuned weight equals the default, so it is shown once.</w:t>
       </w:r>
     </w:p>
     <w:p>
@@ -11670,16 +11765,17 @@
         <w:tblCaption w:val="Table 4. Retrieval quality on SciFact (300 test claims, all-MiniLM-L6-v2). The p-value compares each method with hybrid fusion at \alpha = 0.5."/>
       </w:tblPr>
       <w:tblGrid>
-        <w:gridCol w:w="2897"/>
-        <w:gridCol w:w="869"/>
-        <w:gridCol w:w="1545"/>
-        <w:gridCol w:w="869"/>
-        <w:gridCol w:w="869"/>
-        <w:gridCol w:w="869"/>
+        <w:gridCol w:w="1980"/>
+        <w:gridCol w:w="1080"/>
+        <w:gridCol w:w="1530"/>
+        <w:gridCol w:w="1260"/>
+        <w:gridCol w:w="1080"/>
+        <w:gridCol w:w="990"/>
       </w:tblGrid>
       <w:tr>
         <w:trPr>
           <w:tblHeader w:val="true"/>
+          <w:cantSplit/>
         </w:trPr>
         <w:tc>
           <w:tcPr/>
@@ -11755,6 +11851,9 @@
         </w:tc>
       </w:tr>
       <w:tr>
+        <w:trPr>
+          <w:cantSplit/>
+        </w:trPr>
         <w:tc>
           <w:tcPr/>
           <w:p>
@@ -11829,6 +11928,9 @@
         </w:tc>
       </w:tr>
       <w:tr>
+        <w:trPr>
+          <w:cantSplit/>
+        </w:trPr>
         <w:tc>
           <w:tcPr/>
           <w:p>
@@ -11903,6 +12005,9 @@
         </w:tc>
       </w:tr>
       <w:tr>
+        <w:trPr>
+          <w:cantSplit/>
+        </w:trPr>
         <w:tc>
           <w:tcPr/>
           <w:p>
@@ -11977,6 +12082,9 @@
         </w:tc>
       </w:tr>
       <w:tr>
+        <w:trPr>
+          <w:cantSplit/>
+        </w:trPr>
         <w:tc>
           <w:tcPr/>
           <w:p>
@@ -12081,6 +12189,9 @@
         </w:tc>
       </w:tr>
       <w:tr>
+        <w:trPr>
+          <w:cantSplit/>
+        </w:trPr>
         <w:tc>
           <w:tcPr/>
           <w:p>
@@ -12246,9 +12357,9 @@
       <w:r>
         <w:drawing>
           <wp:inline>
-            <wp:extent cx="5969000" cy="2609365"/>
+            <wp:extent cx="5969000" cy="2440789"/>
             <wp:effectExtent b="0" l="0" r="0" t="0"/>
-            <wp:docPr descr="Figure 12. (a) nDCG@10 as a function of the fusion weight (line chart); the dotted line marks the weight chosen on training claims. (b) Distribution of end-to-end query latency on SciFact (cumulative distribution)." title="" id="88" name="Picture"/>
+            <wp:docPr descr="Figure 12. (a) nDCG@10 as a function of the fusion weight (line chart); the dotted line marks the weight chosen on training claims. (b) Distribution of end-to-end query latency on SciFact (cumulative distribution); the axis is cut at 25 ms, and one query in the Grover series took 47 ms." title="" id="88" name="Picture"/>
             <a:graphic>
               <a:graphicData uri="http://schemas.openxmlformats.org/drawingml/2006/picture">
                 <pic:pic>
@@ -12267,7 +12378,7 @@
                   <pic:spPr bwMode="auto">
                     <a:xfrm>
                       <a:off x="0" y="0"/>
-                      <a:ext cx="5969000" cy="2609365"/>
+                      <a:ext cx="5969000" cy="2440789"/>
                     </a:xfrm>
                     <a:prstGeom prst="rect">
                       <a:avLst/>
@@ -12301,7 +12412,7 @@
         <w:t xml:space="preserve"> </w:t>
       </w:r>
       <w:r>
-        <w:t xml:space="preserve">(a) nDCG@10 as a function of the fusion weight (line chart); the dotted line marks the weight chosen on training claims. (b) Distribution of end-to-end query latency on SciFact (cumulative distribution).</w:t>
+        <w:t xml:space="preserve">(a) nDCG@10 as a function of the fusion weight (line chart); the dotted line marks the weight chosen on training claims. (b) Distribution of end-to-end query latency on SciFact (cumulative distribution); the axis is cut at 25 ms, and one query in the Grover series took 47 ms.</w:t>
       </w:r>
     </w:p>
     <w:p>
@@ -12329,7 +12440,7 @@
       <w:r>
         <w:drawing>
           <wp:inline>
-            <wp:extent cx="5902314" cy="2403740"/>
+            <wp:extent cx="5969000" cy="2371907"/>
             <wp:effectExtent b="0" l="0" r="0" t="0"/>
             <wp:docPr descr="Figure 13. Mean time per SciFact query by stage (stacked bar chart), MiniLM embedder, top 10." title="" id="91" name="Picture"/>
             <a:graphic>
@@ -12350,7 +12461,7 @@
                   <pic:spPr bwMode="auto">
                     <a:xfrm>
                       <a:off x="0" y="0"/>
-                      <a:ext cx="5902314" cy="2403740"/>
+                      <a:ext cx="5969000" cy="2371907"/>
                     </a:xfrm>
                     <a:prstGeom prst="rect">
                       <a:avLst/>
@@ -12485,47 +12596,76 @@
         <w:t xml:space="preserve"> </w:t>
       </w:r>
       <w:r>
-        <w:t xml:space="preserve">between input and output order (Figure 14). The 1.x reranker returns the input order for 127 of the 255 sizes (</w:t>
+        <w:t xml:space="preserve">between input and output order (Figure 14). The 1.x reranker returns the input order for 127 of the 255 sizes</w:t>
+      </w:r>
+      <w:r>
+        <w:t xml:space="preserve"> </w:t>
       </w:r>
       <m:oMath>
-        <m:r>
-          <m:t>τ</m:t>
-        </m:r>
-        <m:r>
-          <m:rPr>
-            <m:sty m:val="p"/>
-          </m:rPr>
-          <m:t>=</m:t>
-        </m:r>
-        <m:r>
-          <m:t>1</m:t>
-        </m:r>
+        <m:d>
+          <m:dPr>
+            <m:begChr m:val="("/>
+            <m:endChr m:val=")"/>
+            <m:sepChr m:val=""/>
+            <m:grow/>
+          </m:dPr>
+          <m:e>
+            <m:r>
+              <m:t>τ</m:t>
+            </m:r>
+            <m:r>
+              <m:rPr>
+                <m:sty m:val="p"/>
+              </m:rPr>
+              <m:t>=</m:t>
+            </m:r>
+            <m:r>
+              <m:t>1</m:t>
+            </m:r>
+          </m:e>
+        </m:d>
       </m:oMath>
       <w:r>
-        <w:t xml:space="preserve">) and the exact reverse for the other 128 (</w:t>
+        <w:t xml:space="preserve"> </w:t>
+      </w:r>
+      <w:r>
+        <w:t xml:space="preserve">and the exact reverse for the other 128</w:t>
+      </w:r>
+      <w:r>
+        <w:t xml:space="preserve"> </w:t>
       </w:r>
       <m:oMath>
-        <m:r>
-          <m:t>τ</m:t>
-        </m:r>
-        <m:r>
-          <m:rPr>
-            <m:sty m:val="p"/>
-          </m:rPr>
-          <m:t>=</m:t>
-        </m:r>
-        <m:r>
-          <m:rPr>
-            <m:sty m:val="p"/>
-          </m:rPr>
-          <m:t>−</m:t>
-        </m:r>
-        <m:r>
-          <m:t>1</m:t>
-        </m:r>
+        <m:d>
+          <m:dPr>
+            <m:begChr m:val="("/>
+            <m:endChr m:val=")"/>
+            <m:sepChr m:val=""/>
+            <m:grow/>
+          </m:dPr>
+          <m:e>
+            <m:r>
+              <m:t>τ</m:t>
+            </m:r>
+            <m:r>
+              <m:rPr>
+                <m:sty m:val="p"/>
+              </m:rPr>
+              <m:t>=</m:t>
+            </m:r>
+            <m:r>
+              <m:rPr>
+                <m:sty m:val="p"/>
+              </m:rPr>
+              <m:t>−</m:t>
+            </m:r>
+            <m:r>
+              <m:t>1</m:t>
+            </m:r>
+          </m:e>
+        </m:d>
       </m:oMath>
       <w:r>
-        <w:t xml:space="preserve">), with no other outcome, as Proposition 1 predicts. With random scores (20 trials per size) the best candidate stayed first in only 49.8% of cases and the mean</w:t>
+        <w:t xml:space="preserve">, with no other outcome, as Proposition 1 predicts. With random scores (20 trials per size) the best candidate stayed first in only 49.8% of cases and the mean</w:t>
       </w:r>
       <w:r>
         <w:t xml:space="preserve"> </w:t>
@@ -12860,6 +13000,7 @@
       <w:tr>
         <w:trPr>
           <w:tblHeader w:val="true"/>
+          <w:cantSplit/>
         </w:trPr>
         <w:tc>
           <w:tcPr/>
@@ -12965,6 +13106,9 @@
         </w:tc>
       </w:tr>
       <w:tr>
+        <w:trPr>
+          <w:cantSplit/>
+        </w:trPr>
         <w:tc>
           <w:tcPr/>
           <w:p>
@@ -13063,6 +13207,9 @@
         </w:tc>
       </w:tr>
       <w:tr>
+        <w:trPr>
+          <w:cantSplit/>
+        </w:trPr>
         <w:tc>
           <w:tcPr/>
           <w:p>
@@ -13161,6 +13308,9 @@
         </w:tc>
       </w:tr>
       <w:tr>
+        <w:trPr>
+          <w:cantSplit/>
+        </w:trPr>
         <w:tc>
           <w:tcPr/>
           <w:p>
@@ -13259,6 +13409,9 @@
         </w:tc>
       </w:tr>
       <w:tr>
+        <w:trPr>
+          <w:cantSplit/>
+        </w:trPr>
         <w:tc>
           <w:tcPr/>
           <w:p>
@@ -13375,7 +13528,7 @@
       <w:r>
         <w:drawing>
           <wp:inline>
-            <wp:extent cx="5969000" cy="2601871"/>
+            <wp:extent cx="5969000" cy="2603438"/>
             <wp:effectExtent b="0" l="0" r="0" t="0"/>
             <wp:docPr descr="Figure 15. (a) Recall@10 within a namespace as its share of a 100,000-vector vault grows (line chart). (b) Results returned and search rounds for metadata filters of decreasing selectivity on 50,000 documents (bar and line chart)." title="" id="99" name="Picture"/>
             <a:graphic>
@@ -13396,7 +13549,7 @@
                   <pic:spPr bwMode="auto">
                     <a:xfrm>
                       <a:off x="0" y="0"/>
-                      <a:ext cx="5969000" cy="2601871"/>
+                      <a:ext cx="5969000" cy="2603438"/>
                     </a:xfrm>
                     <a:prstGeom prst="rect">
                       <a:avLst/>
@@ -13524,6 +13677,7 @@
       <w:tr>
         <w:trPr>
           <w:tblHeader w:val="true"/>
+          <w:cantSplit/>
         </w:trPr>
         <w:tc>
           <w:tcPr/>
@@ -13599,6 +13753,9 @@
         </w:tc>
       </w:tr>
       <w:tr>
+        <w:trPr>
+          <w:cantSplit/>
+        </w:trPr>
         <w:tc>
           <w:tcPr/>
           <w:p>
@@ -13673,6 +13830,9 @@
         </w:tc>
       </w:tr>
       <w:tr>
+        <w:trPr>
+          <w:cantSplit/>
+        </w:trPr>
         <w:tc>
           <w:tcPr/>
           <w:p>
@@ -13747,6 +13907,9 @@
         </w:tc>
       </w:tr>
       <w:tr>
+        <w:trPr>
+          <w:cantSplit/>
+        </w:trPr>
         <w:tc>
           <w:tcPr/>
           <w:p>
@@ -13821,6 +13984,9 @@
         </w:tc>
       </w:tr>
       <w:tr>
+        <w:trPr>
+          <w:cantSplit/>
+        </w:trPr>
         <w:tc>
           <w:tcPr/>
           <w:p>
@@ -14025,9 +14191,9 @@
       <w:r>
         <w:drawing>
           <wp:inline>
-            <wp:extent cx="5969000" cy="2454051"/>
+            <wp:extent cx="5969000" cy="2404388"/>
             <wp:effectExtent b="0" l="0" r="0" t="0"/>
-            <wp:docPr descr="Figure 16. (a) Total time to insert documents one at a time into the keyword index (log-log line chart). (b) Time to open a vault from its snapshot and by rebuilding the indexes (bar chart, log scale)." title="" id="104" name="Picture"/>
+            <wp:docPr descr="Figure 16. (a) Total time to insert documents one at a time into the keyword index (log-log line chart). (b) Time to open a vault from its snapshot and by rebuilding the indexes (line chart, log scale)." title="" id="104" name="Picture"/>
             <a:graphic>
               <a:graphicData uri="http://schemas.openxmlformats.org/drawingml/2006/picture">
                 <pic:pic>
@@ -14046,7 +14212,7 @@
                   <pic:spPr bwMode="auto">
                     <a:xfrm>
                       <a:off x="0" y="0"/>
-                      <a:ext cx="5969000" cy="2454051"/>
+                      <a:ext cx="5969000" cy="2404388"/>
                     </a:xfrm>
                     <a:prstGeom prst="rect">
                       <a:avLst/>
@@ -14080,7 +14246,7 @@
         <w:t xml:space="preserve"> </w:t>
       </w:r>
       <w:r>
-        <w:t xml:space="preserve">(a) Total time to insert documents one at a time into the keyword index (log-log line chart). (b) Time to open a vault from its snapshot and by rebuilding the indexes (bar chart, log scale).</w:t>
+        <w:t xml:space="preserve">(a) Total time to insert documents one at a time into the keyword index (log-log line chart). (b) Time to open a vault from its snapshot and by rebuilding the indexes (line chart, log scale).</w:t>
       </w:r>
     </w:p>
     <w:p>
@@ -14119,6 +14285,7 @@
       <w:tr>
         <w:trPr>
           <w:tblHeader w:val="true"/>
+          <w:cantSplit/>
         </w:trPr>
         <w:tc>
           <w:tcPr/>
@@ -14182,6 +14349,9 @@
         </w:tc>
       </w:tr>
       <w:tr>
+        <w:trPr>
+          <w:cantSplit/>
+        </w:trPr>
         <w:tc>
           <w:tcPr/>
           <w:p>
@@ -14244,6 +14414,9 @@
         </w:tc>
       </w:tr>
       <w:tr>
+        <w:trPr>
+          <w:cantSplit/>
+        </w:trPr>
         <w:tc>
           <w:tcPr/>
           <w:p>
@@ -14306,6 +14479,9 @@
         </w:tc>
       </w:tr>
       <w:tr>
+        <w:trPr>
+          <w:cantSplit/>
+        </w:trPr>
         <w:tc>
           <w:tcPr/>
           <w:p>
@@ -14815,6 +14991,7 @@
       <w:tr>
         <w:trPr>
           <w:tblHeader w:val="true"/>
+          <w:cantSplit/>
         </w:trPr>
         <w:tc>
           <w:tcPr/>
@@ -14878,6 +15055,9 @@
         </w:tc>
       </w:tr>
       <w:tr>
+        <w:trPr>
+          <w:cantSplit/>
+        </w:trPr>
         <w:tc>
           <w:tcPr/>
           <w:p>
@@ -14943,6 +15123,9 @@
         </w:tc>
       </w:tr>
       <w:tr>
+        <w:trPr>
+          <w:cantSplit/>
+        </w:trPr>
         <w:tc>
           <w:tcPr/>
           <w:p>
@@ -15008,6 +15191,9 @@
         </w:tc>
       </w:tr>
       <w:tr>
+        <w:trPr>
+          <w:cantSplit/>
+        </w:trPr>
         <w:tc>
           <w:tcPr/>
           <w:p>
@@ -15144,6 +15330,7 @@
       <w:tr>
         <w:trPr>
           <w:tblHeader w:val="true"/>
+          <w:cantSplit/>
         </w:trPr>
         <w:tc>
           <w:tcPr/>
@@ -15183,6 +15370,9 @@
         </w:tc>
       </w:tr>
       <w:tr>
+        <w:trPr>
+          <w:cantSplit/>
+        </w:trPr>
         <w:tc>
           <w:tcPr/>
           <w:p>
@@ -15221,6 +15411,9 @@
         </w:tc>
       </w:tr>
       <w:tr>
+        <w:trPr>
+          <w:cantSplit/>
+        </w:trPr>
         <w:tc>
           <w:tcPr/>
           <w:p>
@@ -15259,6 +15452,9 @@
         </w:tc>
       </w:tr>
       <w:tr>
+        <w:trPr>
+          <w:cantSplit/>
+        </w:trPr>
         <w:tc>
           <w:tcPr/>
           <w:p>
@@ -15297,6 +15493,9 @@
         </w:tc>
       </w:tr>
       <w:tr>
+        <w:trPr>
+          <w:cantSplit/>
+        </w:trPr>
         <w:tc>
           <w:tcPr/>
           <w:p>
@@ -15506,6 +15705,7 @@
       <w:tr>
         <w:trPr>
           <w:tblHeader w:val="true"/>
+          <w:cantSplit/>
         </w:trPr>
         <w:tc>
           <w:tcPr/>
@@ -15569,6 +15769,9 @@
         </w:tc>
       </w:tr>
       <w:tr>
+        <w:trPr>
+          <w:cantSplit/>
+        </w:trPr>
         <w:tc>
           <w:tcPr/>
           <w:p>
@@ -15631,6 +15834,9 @@
         </w:tc>
       </w:tr>
       <w:tr>
+        <w:trPr>
+          <w:cantSplit/>
+        </w:trPr>
         <w:tc>
           <w:tcPr/>
           <w:p>
@@ -15693,6 +15899,9 @@
         </w:tc>
       </w:tr>
       <w:tr>
+        <w:trPr>
+          <w:cantSplit/>
+        </w:trPr>
         <w:tc>
           <w:tcPr/>
           <w:p>
@@ -15770,7 +15979,7 @@
         <w:t xml:space="preserve"> </w:t>
       </w:r>
       <w:r>
-        <w:t xml:space="preserve">We run 400 unique searches over a 50,000-document vault from 1, 2, 4 and 8 threads that share one vault object, three times in rotating order (Figure 20b). Throughput rose from a median of 112 queries per second with one thread to 153 with two and stayed between 141 and 153 with four and eight. The spread between runs was large, up to 50 queries per second, so only the plateau is clear. The vault’s lock serialises the core of each search, so extra threads mainly overlap the work done outside it. Concurrency did not change results: for 200 queries, eight threads returned exactly the same top-10 lists as one thread. Read-heavy services can run one vault handle per worker process, at the cost of one copy of the indexes per process; parallel search inside one vault is future work.</w:t>
+        <w:t xml:space="preserve">We run 400 unique searches over a 50,000-document vault from 1, 2, 4 and 8 threads that share one vault object, three times in rotating order (Figure 21b). Throughput rose from a median of 112 queries per second with one thread to 153 with two and stayed between 141 and 153 with four and eight. The spread between runs was large, up to 50 queries per second, so only the plateau is clear. The vault’s lock serialises the core of each search, so extra threads mainly overlap the work done outside it. Concurrency did not change results: for 200 queries, eight threads returned exactly the same top-10 lists as one thread. Read-heavy services can run one vault handle per worker process, at the cost of one copy of the indexes per process; parallel search inside one vault is future work.</w:t>
       </w:r>
     </w:p>
     <w:p>
@@ -15780,7 +15989,7 @@
       <w:r>
         <w:drawing>
           <wp:inline>
-            <wp:extent cx="5969000" cy="2634278"/>
+            <wp:extent cx="5969000" cy="2512461"/>
             <wp:effectExtent b="0" l="0" r="0" t="0"/>
             <wp:docPr descr="Figure 21. (a) Median search latency while documents are deleted from a 50,000-document vault (line chart); compaction runs when tombstones pass 20%. (b) Search throughput with 1 to 8 client threads sharing one vault (line chart)." title="" id="123" name="Picture"/>
             <a:graphic>
@@ -15801,7 +16010,7 @@
                   <pic:spPr bwMode="auto">
                     <a:xfrm>
                       <a:off x="0" y="0"/>
-                      <a:ext cx="5969000" cy="2634278"/>
+                      <a:ext cx="5969000" cy="2512461"/>
                     </a:xfrm>
                     <a:prstGeom prst="rect">
                       <a:avLst/>
@@ -17899,6 +18108,7 @@
     <w:bookmarkEnd w:id="187"/>
     <w:bookmarkEnd w:id="188"/>
     <w:sectPr>
+      <w:footerReference r:id="rId9" w:type="default"/>
       <w:pgSz w:h="16838" w:w="11906"/>
       <w:pgMar w:bottom="1304" w:left="1247" w:right="1247" w:top="1304"/>
     </w:sectPr>
@@ -17908,6 +18118,27 @@
 
 <file path=word/comments.xml><?xml version="1.0" encoding="utf-8"?>
 <w:comments xmlns:w="http://schemas.openxmlformats.org/wordprocessingml/2006/main" xmlns:m="http://schemas.openxmlformats.org/officeDocument/2006/math" xmlns:r="http://schemas.openxmlformats.org/officeDocument/2006/relationships" xmlns:o="urn:schemas-microsoft-com:office:office" xmlns:v="urn:schemas-microsoft-com:vml" xmlns:w10="urn:schemas-microsoft-com:office:word" xmlns:a="http://schemas.openxmlformats.org/drawingml/2006/main" xmlns:pic="http://schemas.openxmlformats.org/drawingml/2006/picture" xmlns:wp="http://schemas.openxmlformats.org/drawingml/2006/wordprocessingDrawing"/>
+</file>
+
+<file path=word/footer1.xml><?xml version="1.0" encoding="utf-8"?>
+<w:ftr xmlns:m="http://schemas.openxmlformats.org/officeDocument/2006/math" xmlns:mc="http://schemas.openxmlformats.org/markup-compatibility/2006" xmlns:mo="http://schemas.microsoft.com/office/mac/office/2008/main" xmlns:mv="urn:schemas-microsoft-com:mac:vml" xmlns:o="urn:schemas-microsoft-com:office:office" xmlns:r="http://schemas.openxmlformats.org/officeDocument/2006/relationships" xmlns:v="urn:schemas-microsoft-com:vml" xmlns:w10="urn:schemas-microsoft-com:office:word" xmlns:w14="http://schemas.microsoft.com/office/word/2010/wordml" xmlns:w="http://schemas.openxmlformats.org/wordprocessingml/2006/main" xmlns:wne="http://schemas.microsoft.com/office/word/2006/wordml" xmlns:wp14="http://schemas.microsoft.com/office/word/2010/wordprocessingDrawing" xmlns:wp="http://schemas.openxmlformats.org/drawingml/2006/wordprocessingDrawing" xmlns:wpc="http://schemas.microsoft.com/office/word/2010/wordprocessingCanvas" xmlns:wpg="http://schemas.microsoft.com/office/word/2010/wordprocessingGroup" xmlns:wpi="http://schemas.microsoft.com/office/word/2010/wordprocessingInk" xmlns:wps="http://schemas.microsoft.com/office/word/2010/wordprocessingShape" mc:Ignorable="w14 wp14">
+  <w:p>
+    <w:pPr>
+      <w:pStyle w:val="Footer"/>
+      <w:jc w:val="center"/>
+    </w:pPr>
+    <w:r>
+      <w:fldSimple w:instr="PAGE">
+        <w:r>
+          <w:rPr>
+            <w:sz w:val="17"/>
+          </w:rPr>
+          <w:t>1</w:t>
+        </w:r>
+      </w:fldSimple>
+    </w:r>
+  </w:p>
+</w:ftr>
 </file>
 
 <file path=word/footnotes.xml><?xml version="1.0" encoding="utf-8"?>

</xml_diff>